<commit_message>
Add demo GIFs and update documentation with screenshots and evidence
</commit_message>
<xml_diff>
--- a/docs/Context_Cloak_DevCentral_Article.docx
+++ b/docs/Context_Cloak_DevCentral_Article.docx
@@ -799,9 +799,11 @@
       <w:r>
         <w:rPr>
           <w:b/>
-          <w:color w:val="FF6464"/>
+          <w:color w:val="0066CC"/>
         </w:rPr>
-        <w:t>[GIF: substitute-demo-accounts.gif]</w:t>
+        <w:t>[GIF: docs/gifs/demo_cloak_substitution_accounts_john_doe.gif]</w:t>
+        <w:br/>
+        <w:t>Open WebUI shows John Doe with real account numbers. vLLM logs show "Maria Garcia" with fake account numbers. The LLM never saw the real data.</w:t>
       </w:r>
     </w:p>
     <w:p>
@@ -870,9 +872,11 @@
       <w:r>
         <w:rPr>
           <w:b/>
-          <w:color w:val="FF6464"/>
+          <w:color w:val="0066CC"/>
         </w:rPr>
-        <w:t>[GIF: tokenize-demo-ssn.gif]</w:t>
+        <w:t>[GIF: docs/gifs/context_cload_tokenize_ssn_jane_smith.gif]</w:t>
+        <w:br/>
+        <w:t>Open WebUI shows Jane Smith SSN 219-09-9999. vLLM logs show "Maria Thompson" with &lt;&lt;SSN:32.192.169.232:001&gt;&gt;. Mixed substitute + tokenize in the same request.</w:t>
       </w:r>
     </w:p>
     <w:p>
@@ -918,9 +922,11 @@
       <w:r>
         <w:rPr>
           <w:b/>
-          <w:color w:val="FF6464"/>
+          <w:color w:val="0066CC"/>
         </w:rPr>
-        <w:t>[GIF: full-tokenize-demo.gif]</w:t>
+        <w:t>[GIF: docs/gifs/context_cloak_tokenize_accounts_jane_smith.gif]</w:t>
+        <w:br/>
+        <w:t>Open WebUI shows Carlos Rivera with all real data. vLLM logs show every field as &lt;&lt;TYPE:SESSION:SEQ&gt;&gt; tokens. The LLM even apologized for the "masked" data.</w:t>
       </w:r>
     </w:p>
     <w:p>
@@ -1006,9 +1012,11 @@
       <w:r>
         <w:rPr>
           <w:b/>
-          <w:color w:val="FF6464"/>
+          <w:color w:val="0066CC"/>
         </w:rPr>
-        <w:t>[GIF: architecture-flow.gif — or static diagram showing the full data path]</w:t>
+        <w:t>[GIF: docs/gifs/context_cloak_deploy.gif]</w:t>
+        <w:br/>
+        <w:t>Context Cloak GUI showing full configuration — MCP server, LLM endpoint, PII fields with cloaking modes, session config. One-click deploy creates all BIG-IP objects.</w:t>
       </w:r>
     </w:p>
     <w:p>
@@ -1024,6 +1032,98 @@
         <w:t>• Open WebUI as the chat interface</w:t>
         <w:br/>
         <w:t>• Context Cloak iAppLX managing the entire configuration via web GUI</w:t>
+      </w:r>
+    </w:p>
+    <w:p>
+      <w:pPr>
+        <w:pStyle w:val="Heading3"/>
+      </w:pPr>
+      <w:r>
+        <w:t>Installation and Setup</w:t>
+      </w:r>
+    </w:p>
+    <w:p>
+      <w:pPr>
+        <w:jc w:val="center"/>
+      </w:pPr>
+      <w:r>
+        <w:rPr>
+          <w:b/>
+          <w:color w:val="0066CC"/>
+        </w:rPr>
+        <w:t>[GIF: docs/gifs/load_rpm.gif]</w:t>
+      </w:r>
+    </w:p>
+    <w:p>
+      <w:r>
+        <w:t>Installing the Context Cloak RPM via BIG-IP Package Management LX.</w:t>
+      </w:r>
+    </w:p>
+    <w:p>
+      <w:pPr>
+        <w:jc w:val="center"/>
+      </w:pPr>
+      <w:r>
+        <w:rPr>
+          <w:b/>
+          <w:color w:val="0066CC"/>
+        </w:rPr>
+        <w:t>[GIF: docs/gifs/show_vs.gif]</w:t>
+      </w:r>
+    </w:p>
+    <w:p>
+      <w:r>
+        <w:t>After deployment: BIG-IP Local Traffic showing the MCP VS and Inference VS created by Context Cloak.</w:t>
+      </w:r>
+    </w:p>
+    <w:p>
+      <w:pPr>
+        <w:pStyle w:val="Heading3"/>
+      </w:pPr>
+      <w:r>
+        <w:t>Baseline: No Cloaking</w:t>
+      </w:r>
+    </w:p>
+    <w:p>
+      <w:pPr>
+        <w:jc w:val="center"/>
+      </w:pPr>
+      <w:r>
+        <w:rPr>
+          <w:b/>
+          <w:color w:val="0066CC"/>
+        </w:rPr>
+        <w:t>[GIF: docs/gifs/test_no_cloak.gif]</w:t>
+      </w:r>
+    </w:p>
+    <w:p>
+      <w:r>
+        <w:t>Without Context Cloak: Open WebUI sends prompts directly to vLLM. All PII — names, SSNs, account numbers — flows to the LLM in cleartext. This is the "before" picture.</w:t>
+      </w:r>
+    </w:p>
+    <w:p>
+      <w:pPr>
+        <w:pStyle w:val="Heading3"/>
+      </w:pPr>
+      <w:r>
+        <w:t>Switching Modes</w:t>
+      </w:r>
+    </w:p>
+    <w:p>
+      <w:pPr>
+        <w:jc w:val="center"/>
+      </w:pPr>
+      <w:r>
+        <w:rPr>
+          <w:b/>
+          <w:color w:val="0066CC"/>
+        </w:rPr>
+        <w:t>[GIF: docs/gifs/context_cloak_change_to_tokenize.gif]</w:t>
+      </w:r>
+    </w:p>
+    <w:p>
+      <w:r>
+        <w:t>Changing PII field modes from Substitute to Tokenize in the Context Cloak GUI. Per-field configuration — mix and match modes based on your security requirements.</w:t>
       </w:r>
     </w:p>
     <w:sectPr>

</xml_diff>

<commit_message>
Update tokenize messaging, Veitch timestamp to 4:40 candy scene
</commit_message>
<xml_diff>
--- a/docs/Context_Cloak_DevCentral_Article.docx
+++ b/docs/Context_Cloak_DevCentral_Article.docx
@@ -351,7 +351,7 @@
     </w:p>
     <w:p>
       <w:r>
-        <w:t>I like to compare it to James Veitch's famous TED talk about messing with email scammers -- he swapped "bank account" for types of candy and the scammer kept negotiating without realizing they were discussing gummy bears instead of wire transfers. Same principle: swap the sensitive nouns, keep the structure, and the conversation works perfectly.</w:t>
+        <w:t>I like to compare it to James Veitch's famous TED talk about messing with email scammers — at about the 4:40 mark, he describes swapping banking terms for types of candy, and the scammer keeps negotiating without realizing they're discussing gummy bears instead of wire transfers. Same principle: swap the sensitive nouns, keep the structure, and the conversation works perfectly.</w:t>
       </w:r>
     </w:p>
     <w:p>
@@ -380,7 +380,7 @@
         <w:pStyle w:val="ListBullet"/>
       </w:pPr>
       <w:r>
-        <w:t>Tokenize mode: Replaces PII with structured placeholders like &lt;&lt;SSN:session:001&gt;&gt;. The LLM can't reason about these naturally, but they're designed to be caught by downstream guardrails if any leak through. Best for defense-in-depth scenarios with F5 AI Gateway.</w:t>
+        <w:t>Tokenize mode: Replaces PII with structured placeholders like &lt;&lt;SSN:session:001&gt;&gt;. This mode is designed for defense-in-depth scenarios where downstream guardrails (like F5 AI Gateway) need to catch any leaked PII. The tokens are intentionally distinctive — if one slips through de-cloaking, a guardrails policy can pattern-match it. Note: smaller LLMs (7B parameters) may struggle to reproduce tokens verbatim — they sometimes strip brackets, hallucinate values, or refuse to display the placeholders. Larger models (14B+) handle tokenize mode reliably. Both modes can be mixed per field in the same request.</w:t>
       </w:r>
     </w:p>
     <w:p>

</xml_diff>

<commit_message>
Replace AI Gateway with AI Guardrails throughout
</commit_message>
<xml_diff>
--- a/docs/Context_Cloak_DevCentral_Article.docx
+++ b/docs/Context_Cloak_DevCentral_Article.docx
@@ -380,7 +380,7 @@
         <w:pStyle w:val="ListBullet"/>
       </w:pPr>
       <w:r>
-        <w:t>Tokenize mode: Replaces PII with structured placeholders like &lt;&lt;SSN:session:001&gt;&gt;. This mode is designed for defense-in-depth scenarios where downstream guardrails (like F5 AI Gateway) need to catch any leaked PII. The tokens are intentionally distinctive — if one slips through de-cloaking, a guardrails policy can pattern-match it. Note: smaller LLMs (7B parameters) may struggle to reproduce tokens verbatim — they sometimes strip brackets, hallucinate values, or refuse to display the placeholders. Larger models (14B+) handle tokenize mode reliably. Both modes can be mixed per field in the same request.</w:t>
+        <w:t>Tokenize mode: Replaces PII with structured placeholders like &lt;&lt;SSN:session:001&gt;&gt;. This mode is designed for defense-in-depth scenarios where downstream guardrails (like F5 AI Guardrails) need to catch any leaked PII. The tokens are intentionally distinctive — if one slips through de-cloaking, a guardrails policy can pattern-match it. Note: smaller LLMs (7B parameters) may struggle to reproduce tokens verbatim — they sometimes strip brackets, hallucinate values, or refuse to display the placeholders. Larger models (14B+) handle tokenize mode reliably. Both modes can be mixed per field in the same request.</w:t>
       </w:r>
     </w:p>
     <w:p>
@@ -652,17 +652,17 @@
         <w:pStyle w:val="Heading2"/>
       </w:pPr>
       <w:r>
-        <w:t>What's Next: F5 AI Gateway Integration</w:t>
+        <w:t>What's Next: F5 AI Guardrails Integration</w:t>
       </w:r>
     </w:p>
     <w:p>
       <w:r>
-        <w:t>Context Cloak's tokenize mode is designed to complement F5 AI Gateway. The &lt;&lt;TYPE:ID:SEQ&gt;&gt; format is intentionally distinctive -- if any token leaks through de-cloaking (because the LLM rephrased or reformatted it), a guardrails policy can catch it as a pattern match violation.</w:t>
+        <w:t>Context Cloak's tokenize mode is designed to complement F5 AI Guardrails. The &lt;&lt;TYPE:ID:SEQ&gt;&gt; format is intentionally distinctive -- if any token leaks through de-cloaking (because the LLM rephrased or reformatted it), a guardrails policy can catch it as a pattern match violation.</w:t>
       </w:r>
     </w:p>
     <w:p>
       <w:r>
-        <w:t>The vision: Context Cloak as the first layer of defense (PII never reaches the LLM), AI Gateway as the safety net (catches anything that slips through). Defense in depth for AI data protection.</w:t>
+        <w:t>The vision: Context Cloak as the first layer of defense (PII never reaches the LLM), AI Guardrails as the safety net (catches anything that slips through). Defense in depth for AI data protection.</w:t>
       </w:r>
     </w:p>
     <w:p>

</xml_diff>

<commit_message>
Align Word doc opening with README narrative
</commit_message>
<xml_diff>
--- a/docs/Context_Cloak_DevCentral_Article.docx
+++ b/docs/Context_Cloak_DevCentral_Article.docx
@@ -36,22 +36,22 @@
         <w:pStyle w:val="Heading2"/>
       </w:pPr>
       <w:r>
-        <w:t>Down the AI Rabbit Hole</w:t>
+        <w:t>The Story</w:t>
       </w:r>
     </w:p>
     <w:p>
       <w:r>
-        <w:t>Like a lot of people in the infrastructure and security space, I didn't set out to build an AI project. It started with curiosity -- I wanted to understand what all the buzz around LLMs, MCP servers, and agentic workflows actually meant in practice. So I started experimenting. I deployed vLLM with open-source models, connected Open WebUI as a chat interface, wired up MCP servers to give LLMs access to structured data, and started asking questions like "generate a financial report for this customer."</w:t>
+        <w:t>As I dove deeper into the world of AI -- MCP servers, LLM orchestration, tool-calling models, agentic workflows -- one question kept nagging me: how do you use the power of LLMs to process sensitive data without actually exposing that data to the model?</w:t>
       </w:r>
     </w:p>
     <w:p>
       <w:r>
-        <w:t>And it worked. Impressively well. The LLM pulled customer data through MCP tools, chained multiple lookups together, and produced polished reports with transaction summaries, spending analysis, and formatted tables. The power of these workflows is undeniable.</w:t>
+        <w:t>Banks, healthcare providers, government agencies -- they all want to leverage AI for report generation, customer analysis, and workflow automation. But the data they need to process is full of PII: Social Security Numbers, account numbers, names, phone numbers. Sending that to an LLM (whether cloud-hosted or self-hosted) creates a security and compliance risk that most organizations can't accept.</w:t>
       </w:r>
     </w:p>
     <w:p>
       <w:r>
-        <w:t>But then I looked at what the LLM actually received in the prompt: names, Social Security Numbers, account numbers, phone numbers, email addresses -- real PII, sitting in the model's context window. And I thought: this is exactly the kind of thing that keeps CISOs up at night.</w:t>
+        <w:t>I've spent years working with F5 technology, and when I learned that BIG-IP TMOS v21 added native support for the MCP protocol, the lightbulb went on. BIG-IP already sits in the data path between clients and servers. It already inspects, transforms, and enforces policy on HTTP traffic. What if it could transparently cloak PII before it reaches the LLM, and de-cloak it on the way back? That's Context Cloak.</w:t>
       </w:r>
     </w:p>
     <w:p>
@@ -64,7 +64,7 @@
     </w:p>
     <w:p>
       <w:r>
-        <w:t>The core tension in AI-powered enterprise workflows is this: LLMs are incredibly powerful tools for processing, summarizing, and reasoning about data. But they need to see the data to work with it. And in regulated industries -- banking, healthcare, government -- that data is full of personally identifiable information that can't be casually handed to a model.</w:t>
+        <w:t>An analyst asks an LLM: "Generate a financial report for John Doe, SSN 078-05-1120, account 4532-1189-0042." The LLM now has real PII. Whether it's logged, cached, fine-tuned on, or exfiltrated -- that data is exposed.</w:t>
       </w:r>
     </w:p>
     <w:p>

</xml_diff>

<commit_message>
Rebuild Word doc with professional formatting - code blocks, bold/italic, tables, GIF placeholders
</commit_message>
<xml_diff>
--- a/docs/Context_Cloak_DevCentral_Article.docx
+++ b/docs/Context_Cloak_DevCentral_Article.docx
@@ -7,7 +7,10 @@
         <w:pStyle w:val="Heading1"/>
       </w:pPr>
       <w:r>
-        <w:t>Context Cloak: Privacy-Preserving PII Cloaking for MCP-Assisted LLM Workflows with F5 BIG-IP</w:t>
+        <w:rPr>
+          <w:color w:val="0064C8"/>
+        </w:rPr>
+        <w:t>Context Cloak</w:t>
       </w:r>
     </w:p>
     <w:p>
@@ -17,17 +20,23 @@
       <w:r>
         <w:rPr>
           <w:b/>
-          <w:sz w:val="24"/>
+        </w:rPr>
+        <w:t>Privacy-Preserving PII Cloaking for MCP-Assisted LLM Workflows</w:t>
+        <w:br/>
+      </w:r>
+      <w:r>
+        <w:t>Powered by F5 BIG-IP TMOS v21</w:t>
+        <w:br/>
+        <w:br/>
+      </w:r>
+      <w:r>
+        <w:rPr>
+          <w:b/>
         </w:rPr>
         <w:t>Jonathan Spigler</w:t>
       </w:r>
       <w:r>
-        <w:br/>
-        <w:t>F5 Solutions Engineer</w:t>
-      </w:r>
-      <w:r>
-        <w:br/>
-        <w:t>April 2026</w:t>
+        <w:t xml:space="preserve"> | F5 Solutions Engineer | April 2026</w:t>
       </w:r>
     </w:p>
     <w:p/>
@@ -41,7 +50,14 @@
     </w:p>
     <w:p>
       <w:r>
-        <w:t>As I dove deeper into the world of AI -- MCP servers, LLM orchestration, tool-calling models, agentic workflows -- one question kept nagging me: how do you use the power of LLMs to process sensitive data without actually exposing that data to the model?</w:t>
+        <w:t xml:space="preserve">As I dove deeper into the world of AI -- MCP servers, LLM orchestration, tool-calling models, agentic workflows -- one question kept nagging me: </w:t>
+      </w:r>
+      <w:r>
+        <w:rPr>
+          <w:b/>
+          <w:i/>
+        </w:rPr>
+        <w:t>how do you use the power of LLMs to process sensitive data without actually exposing that data to the model?</w:t>
       </w:r>
     </w:p>
     <w:p>
@@ -51,7 +67,33 @@
     </w:p>
     <w:p>
       <w:r>
-        <w:t>I've spent years working with F5 technology, and when I learned that BIG-IP TMOS v21 added native support for the MCP protocol, the lightbulb went on. BIG-IP already sits in the data path between clients and servers. It already inspects, transforms, and enforces policy on HTTP traffic. What if it could transparently cloak PII before it reaches the LLM, and de-cloak it on the way back? That's Context Cloak.</w:t>
+        <w:t xml:space="preserve">I've spent years working with F5 technology, and when I learned that </w:t>
+      </w:r>
+      <w:r>
+        <w:rPr>
+          <w:b/>
+        </w:rPr>
+        <w:t>BIG-IP TMOS v21 added native support for the MCP protocol</w:t>
+      </w:r>
+      <w:r>
+        <w:t xml:space="preserve">, the lightbulb went on. BIG-IP already sits in the data path between clients and servers. It already inspects, transforms, and enforces policy on HTTP traffic. What if it could </w:t>
+      </w:r>
+      <w:r>
+        <w:rPr>
+          <w:b/>
+        </w:rPr>
+        <w:t>transparently cloak PII before it reaches the LLM, and de-cloak it on the way back?</w:t>
+      </w:r>
+    </w:p>
+    <w:p>
+      <w:r>
+        <w:t xml:space="preserve">That's </w:t>
+      </w:r>
+      <w:r>
+        <w:rPr>
+          <w:b/>
+        </w:rPr>
+        <w:t>Context Cloak.</w:t>
       </w:r>
     </w:p>
     <w:p>
@@ -59,28 +101,39 @@
         <w:pStyle w:val="Heading2"/>
       </w:pPr>
       <w:r>
-        <w:t>The Problem: PII Exposure in LLM Workflows</w:t>
+        <w:t>The Problem</w:t>
       </w:r>
     </w:p>
     <w:p>
       <w:r>
-        <w:t>An analyst asks an LLM: "Generate a financial report for John Doe, SSN 078-05-1120, account 4532-1189-0042." The LLM now has real PII. Whether it's logged, cached, fine-tuned on, or exfiltrated -- that data is exposed.</w:t>
+        <w:t xml:space="preserve">An analyst asks an LLM: </w:t>
+      </w:r>
+      <w:r>
+        <w:rPr>
+          <w:i/>
+        </w:rPr>
+        <w:t>"Generate a financial report for John Doe, SSN 078-05-1120, account 4532-1189-0042."</w:t>
       </w:r>
     </w:p>
     <w:p>
       <w:r>
-        <w:t>This is true whether the LLM is cloud-hosted (data leaves your environment entirely) or self-hosted (data is logged, cached, potentially used for fine-tuning). The moment PII enters the model's context, you've created a data exposure event that compliance teams need to account for.</w:t>
-      </w:r>
-    </w:p>
-    <w:p>
-      <w:r>
-        <w:t>The traditional approaches to this problem all have fundamental flaws:</w:t>
+        <w:t xml:space="preserve">The LLM now has </w:t>
+      </w:r>
+      <w:r>
+        <w:rPr>
+          <w:b/>
+        </w:rPr>
+        <w:t>real PII</w:t>
+      </w:r>
+      <w:r>
+        <w:t>. Whether it's logged, cached, fine-tuned on, or exfiltrated -- that data is exposed. Traditional approaches fall short:</w:t>
       </w:r>
     </w:p>
     <w:tbl>
       <w:tblPr>
         <w:tblStyle w:val="LightGrid-Accent1"/>
         <w:tblW w:type="auto" w:w="0"/>
+        <w:jc w:val="center"/>
         <w:tblLook w:firstColumn="1" w:firstRow="1" w:lastColumn="0" w:lastRow="0" w:noHBand="0" w:noVBand="1" w:val="04A0"/>
       </w:tblPr>
       <w:tblGrid>
@@ -97,6 +150,7 @@
             <w:r>
               <w:rPr>
                 <w:b/>
+                <w:sz w:val="20"/>
               </w:rPr>
               <w:t>Approach</w:t>
             </w:r>
@@ -110,8 +164,9 @@
             <w:r>
               <w:rPr>
                 <w:b/>
+                <w:sz w:val="20"/>
               </w:rPr>
-              <w:t>Example</w:t>
+              <w:t>What Happens</w:t>
             </w:r>
           </w:p>
         </w:tc>
@@ -123,8 +178,9 @@
             <w:r>
               <w:rPr>
                 <w:b/>
+                <w:sz w:val="20"/>
               </w:rPr>
-              <w:t>Problem</w:t>
+              <w:t>The Issue</w:t>
             </w:r>
           </w:p>
         </w:tc>
@@ -136,7 +192,10 @@
           </w:tcPr>
           <w:p>
             <w:r>
-              <w:t>Masking (redaction)</w:t>
+              <w:rPr>
+                <w:sz w:val="20"/>
+              </w:rPr>
+              <w:t>Masking (****)</w:t>
             </w:r>
           </w:p>
         </w:tc>
@@ -146,7 +205,10 @@
           </w:tcPr>
           <w:p>
             <w:r>
-              <w:t>Report for **** with SSN ***-**-****</w:t>
+              <w:rPr>
+                <w:sz w:val="20"/>
+              </w:rPr>
+              <w:t>LLM can't see the data</w:t>
             </w:r>
           </w:p>
         </w:tc>
@@ -156,7 +218,10 @@
           </w:tcPr>
           <w:p>
             <w:r>
-              <w:t>LLM can't reason about data it can't see</w:t>
+              <w:rPr>
+                <w:sz w:val="20"/>
+              </w:rPr>
+              <w:t>Can't reason about what it can't see</w:t>
             </w:r>
           </w:p>
         </w:tc>
@@ -168,7 +233,10 @@
           </w:tcPr>
           <w:p>
             <w:r>
-              <w:t>Tokenization (placeholders)</w:t>
+              <w:rPr>
+                <w:sz w:val="20"/>
+              </w:rPr>
+              <w:t>Tokenization (&lt;&lt;SSN:001&gt;&gt;)</w:t>
             </w:r>
           </w:p>
         </w:tc>
@@ -178,7 +246,10 @@
           </w:tcPr>
           <w:p>
             <w:r>
-              <w:t>Report for &lt;&lt;NAME:001&gt;&gt; with SSN &lt;&lt;SSN:002&gt;&gt;</w:t>
+              <w:rPr>
+                <w:sz w:val="20"/>
+              </w:rPr>
+              <w:t>LLM sees placeholders</w:t>
             </w:r>
           </w:p>
         </w:tc>
@@ -188,7 +259,10 @@
           </w:tcPr>
           <w:p>
             <w:r>
-              <w:t>LLM knows it's fake, hallucinates or refuses</w:t>
+              <w:rPr>
+                <w:sz w:val="20"/>
+              </w:rPr>
+              <w:t>Works with larger models (14B+); smaller models may hallucinate</w:t>
             </w:r>
           </w:p>
         </w:tc>
@@ -200,6 +274,9 @@
           </w:tcPr>
           <w:p>
             <w:r>
+              <w:rPr>
+                <w:sz w:val="20"/>
+              </w:rPr>
               <w:t>Do nothing</w:t>
             </w:r>
           </w:p>
@@ -210,7 +287,10 @@
           </w:tcPr>
           <w:p>
             <w:r>
-              <w:t>Report for John Doe with SSN 078-05-1120</w:t>
+              <w:rPr>
+                <w:sz w:val="20"/>
+              </w:rPr>
+              <w:t>LLM sees real PII</w:t>
             </w:r>
           </w:p>
         </w:tc>
@@ -220,7 +300,10 @@
           </w:tcPr>
           <w:p>
             <w:r>
-              <w:t>Real PII exposed to the model</w:t>
+              <w:rPr>
+                <w:sz w:val="20"/>
+              </w:rPr>
+              <w:t>Security and compliance violation</w:t>
             </w:r>
           </w:p>
         </w:tc>
@@ -232,22 +315,199 @@
         <w:pStyle w:val="Heading2"/>
       </w:pPr>
       <w:r>
-        <w:t>Enter BIG-IP TMOS v21 and MCP Support</w:t>
+        <w:t>The Solution: Value Substitution</w:t>
       </w:r>
     </w:p>
     <w:p>
       <w:r>
-        <w:t>I've spent years working with F5 technology, and I know BIG-IP's strengths intimately: it sits in the data path, it inspects and transforms HTTP traffic in real-time with iRules, it maintains session state with subtables, and it can be extended with iAppLX packages. It's already the enforcement point for SSL termination, WAF policies, and access control in thousands of organizations.</w:t>
+        <w:t xml:space="preserve">Context Cloak takes a different approach -- </w:t>
+      </w:r>
+      <w:r>
+        <w:rPr>
+          <w:b/>
+        </w:rPr>
+        <w:t>substitute real PII with realistic fake values:</w:t>
       </w:r>
     </w:p>
     <w:p>
-      <w:r>
-        <w:t>When TMOS v21 added native support for the Model Context Protocol (MCP) -- the emerging standard for connecting LLMs to external data sources -- I saw an opportunity. BIG-IP could sit between the MCP server (where the sensitive data lives) and the LLM (where the data must never arrive in cleartext), and transparently swap real PII with realistic fakes.</w:t>
+      <w:pPr>
+        <w:pStyle w:val="CodeBlock"/>
+        <w:shd w:val="clear" w:color="auto" w:fill="1E1E1E"/>
+      </w:pPr>
+      <w:r>
+        <w:rPr>
+          <w:rFonts w:ascii="Consolas" w:hAnsi="Consolas"/>
+          <w:color w:val="D4D4D4"/>
+          <w:sz w:val="18"/>
+        </w:rPr>
+        <w:t>John Doe        --&gt;  Maria Garcia</w:t>
+      </w:r>
+      <w:r>
+        <w:br/>
+      </w:r>
+      <w:r>
+        <w:rPr>
+          <w:rFonts w:ascii="Consolas" w:hAnsi="Consolas"/>
+          <w:color w:val="D4D4D4"/>
+          <w:sz w:val="18"/>
+        </w:rPr>
+        <w:t>078-05-1120     --&gt;  523-50-6675</w:t>
+      </w:r>
+      <w:r>
+        <w:br/>
+      </w:r>
+      <w:r>
+        <w:rPr>
+          <w:rFonts w:ascii="Consolas" w:hAnsi="Consolas"/>
+          <w:color w:val="D4D4D4"/>
+          <w:sz w:val="18"/>
+        </w:rPr>
+        <w:t>4532-1189-0042  --&gt;  7865-4412-3375</w:t>
       </w:r>
     </w:p>
     <w:p>
       <w:r>
-        <w:t>Not masking. Not tokenization. Substitution -- like a cipher. "John Doe" becomes "Maria Garcia." "078-05-1120" becomes "523-50-6675." The LLM sees what looks like real data, reasons about it naturally, generates a perfect report -- and never knows the data was fake. On the way back, BIG-IP swaps the fakes back to the real values. The user sees the real report. The LLM never saw the real PII.</w:t>
+        <w:t xml:space="preserve">The LLM sees what looks like real data and reasons about it naturally. It generates a perfect financial report for "Maria Garcia." On the way back, BIG-IP swaps the fakes back to the real values. The user sees a report about John Doe. </w:t>
+      </w:r>
+      <w:r>
+        <w:rPr>
+          <w:b/>
+        </w:rPr>
+        <w:t>The LLM never knew John Doe existed.</w:t>
+      </w:r>
+    </w:p>
+    <w:p>
+      <w:r>
+        <w:t xml:space="preserve">This is conceptually a </w:t>
+      </w:r>
+      <w:r>
+        <w:rPr>
+          <w:b/>
+        </w:rPr>
+        <w:t>substitution cipher</w:t>
+      </w:r>
+      <w:r>
+        <w:t xml:space="preserve"> -- every real value maps to a consistent fake within the session, and the mapping is reversed transparently.</w:t>
+      </w:r>
+    </w:p>
+    <w:p/>
+    <w:p>
+      <w:r>
+        <w:t xml:space="preserve">When I was thinking about this concept, my mind kept coming back to </w:t>
+      </w:r>
+      <w:r>
+        <w:rPr>
+          <w:b/>
+        </w:rPr>
+        <w:t>James Veitch's TED talk</w:t>
+      </w:r>
+      <w:r>
+        <w:t xml:space="preserve"> about messing with email scammers. Veitch tells the scammer they need to use a code for security:</w:t>
+      </w:r>
+    </w:p>
+    <w:p>
+      <w:pPr>
+        <w:pStyle w:val="CodeBlock"/>
+        <w:shd w:val="clear" w:color="auto" w:fill="1E1E1E"/>
+      </w:pPr>
+      <w:r>
+        <w:rPr>
+          <w:rFonts w:ascii="Consolas" w:hAnsi="Consolas"/>
+          <w:color w:val="D4D4D4"/>
+          <w:sz w:val="18"/>
+        </w:rPr>
+        <w:t>Lawyer         --&gt;  Gummy Bear</w:t>
+      </w:r>
+      <w:r>
+        <w:br/>
+      </w:r>
+      <w:r>
+        <w:rPr>
+          <w:rFonts w:ascii="Consolas" w:hAnsi="Consolas"/>
+          <w:color w:val="D4D4D4"/>
+          <w:sz w:val="18"/>
+        </w:rPr>
+        <w:t>Bank           --&gt;  Cream Egg</w:t>
+      </w:r>
+      <w:r>
+        <w:br/>
+      </w:r>
+      <w:r>
+        <w:rPr>
+          <w:rFonts w:ascii="Consolas" w:hAnsi="Consolas"/>
+          <w:color w:val="D4D4D4"/>
+          <w:sz w:val="18"/>
+        </w:rPr>
+        <w:t>Documents      --&gt;  Jelly Beans</w:t>
+      </w:r>
+      <w:r>
+        <w:br/>
+      </w:r>
+      <w:r>
+        <w:rPr>
+          <w:rFonts w:ascii="Consolas" w:hAnsi="Consolas"/>
+          <w:color w:val="D4D4D4"/>
+          <w:sz w:val="18"/>
+        </w:rPr>
+        <w:t>Western Union  --&gt;  A Giant Gummy Lizard</w:t>
+      </w:r>
+    </w:p>
+    <w:p>
+      <w:r>
+        <w:t xml:space="preserve">The scammer </w:t>
+      </w:r>
+      <w:r>
+        <w:rPr>
+          <w:i/>
+        </w:rPr>
+        <w:t>actually uses the code.</w:t>
+      </w:r>
+      <w:r>
+        <w:t xml:space="preserve"> He writes back:</w:t>
+      </w:r>
+    </w:p>
+    <w:p>
+      <w:pPr>
+        <w:pStyle w:val="Quote"/>
+      </w:pPr>
+      <w:r>
+        <w:rPr>
+          <w:i/>
+        </w:rPr>
+        <w:t>"I am trying to raise the balance for the Gummy Bear so he can submit all the needed Fizzy Cola Bottle Jelly Beans to the Creme Egg... Send 1,500 pounds via a Giant Gummy Lizard."</w:t>
+      </w:r>
+    </w:p>
+    <w:p>
+      <w:r>
+        <w:t xml:space="preserve">The real transaction details -- the amounts, the urgency, the process -- all stayed intact. Only the sensitive terms were swapped. The scammer didn't even question it. That idea stuck with me -- </w:t>
+      </w:r>
+      <w:r>
+        <w:rPr>
+          <w:b/>
+          <w:i/>
+        </w:rPr>
+        <w:t>what if we could do the same thing to protect PII from LLMs?</w:t>
+      </w:r>
+      <w:r>
+        <w:t xml:space="preserve"> But </w:t>
+      </w:r>
+      <w:r>
+        <w:rPr>
+          <w:b/>
+        </w:rPr>
+        <w:t>rotate the candy</w:t>
+      </w:r>
+      <w:r>
+        <w:t xml:space="preserve"> -- so it's not a static code book, but a fresh set of substitutions every session.</w:t>
+      </w:r>
+    </w:p>
+    <w:p>
+      <w:r>
+        <w:rPr>
+          <w:color w:val="0064C8"/>
+          <w:sz w:val="20"/>
+        </w:rPr>
+        <w:t>Watch the talk: https://www.ted.com/talks/james_veitch_this_is_what_happens_when_you_reply_to_spam_email?t=280</w:t>
       </w:r>
     </w:p>
     <w:p>
@@ -255,12 +515,223 @@
         <w:pStyle w:val="Heading2"/>
       </w:pPr>
       <w:r>
-        <w:t>Context Cloak: How It Works</w:t>
+        <w:t>Why BIG-IP?</w:t>
       </w:r>
     </w:p>
     <w:p>
       <w:r>
-        <w:t>Context Cloak is a proof-of-concept that implements this vision as a deployable iAppLX application on BIG-IP. Here's the architecture:</w:t>
+        <w:t>F5 BIG-IP was the natural candidate:</w:t>
+      </w:r>
+    </w:p>
+    <w:p>
+      <w:pPr>
+        <w:pStyle w:val="ListBullet"/>
+      </w:pPr>
+      <w:r>
+        <w:rPr>
+          <w:b/>
+        </w:rPr>
+        <w:t>Already in the data path</w:t>
+      </w:r>
+      <w:r>
+        <w:t xml:space="preserve"> -- BIG-IP is a reverse proxy that organizations already deploy</w:t>
+      </w:r>
+    </w:p>
+    <w:p>
+      <w:pPr>
+        <w:pStyle w:val="ListBullet"/>
+      </w:pPr>
+      <w:r>
+        <w:rPr>
+          <w:b/>
+        </w:rPr>
+        <w:t>MCP protocol support</w:t>
+      </w:r>
+      <w:r>
+        <w:t xml:space="preserve"> -- TMOS v21 added native MCP awareness via iRules</w:t>
+      </w:r>
+    </w:p>
+    <w:p>
+      <w:pPr>
+        <w:pStyle w:val="ListBullet"/>
+      </w:pPr>
+      <w:r>
+        <w:rPr>
+          <w:b/>
+        </w:rPr>
+        <w:t>iRules</w:t>
+      </w:r>
+      <w:r>
+        <w:t xml:space="preserve"> -- Tcl-based traffic manipulation for real-time HTTP payload inspection and rewriting</w:t>
+      </w:r>
+    </w:p>
+    <w:p>
+      <w:pPr>
+        <w:pStyle w:val="ListBullet"/>
+      </w:pPr>
+      <w:r>
+        <w:rPr>
+          <w:b/>
+        </w:rPr>
+        <w:t>Subtables</w:t>
+      </w:r>
+      <w:r>
+        <w:t xml:space="preserve"> -- in-memory key-value storage perfect for session-scoped cloaking maps</w:t>
+      </w:r>
+    </w:p>
+    <w:p>
+      <w:pPr>
+        <w:pStyle w:val="ListBullet"/>
+      </w:pPr>
+      <w:r>
+        <w:rPr>
+          <w:b/>
+        </w:rPr>
+        <w:t>iAppLX</w:t>
+      </w:r>
+      <w:r>
+        <w:t xml:space="preserve"> -- deployable application packages with REST APIs and web UIs</w:t>
+      </w:r>
+    </w:p>
+    <w:p>
+      <w:pPr>
+        <w:pStyle w:val="ListBullet"/>
+      </w:pPr>
+      <w:r>
+        <w:rPr>
+          <w:b/>
+        </w:rPr>
+        <w:t>Trust boundary</w:t>
+      </w:r>
+      <w:r>
+        <w:t xml:space="preserve"> -- BIG-IP is already the enforcement point for SSL, WAF, and access control</w:t>
+      </w:r>
+    </w:p>
+    <w:p>
+      <w:pPr>
+        <w:pStyle w:val="Heading2"/>
+      </w:pPr>
+      <w:r>
+        <w:t>How Context Cloak Works</w:t>
+      </w:r>
+    </w:p>
+    <w:p>
+      <w:r>
+        <w:rPr>
+          <w:b/>
+        </w:rPr>
+        <w:t xml:space="preserve">1. </w:t>
+      </w:r>
+      <w:r>
+        <w:t>An analyst asks a question in Open WebUI</w:t>
+      </w:r>
+    </w:p>
+    <w:p>
+      <w:r>
+        <w:rPr>
+          <w:b/>
+        </w:rPr>
+        <w:t xml:space="preserve">2. </w:t>
+      </w:r>
+      <w:r>
+        <w:t>Open WebUI calls MCP tools through the BIG-IP MCP Virtual Server</w:t>
+      </w:r>
+    </w:p>
+    <w:p>
+      <w:r>
+        <w:rPr>
+          <w:b/>
+        </w:rPr>
+        <w:t xml:space="preserve">3. </w:t>
+      </w:r>
+      <w:r>
+        <w:t>The MCP server queries Postgres and returns real customer data (name, SSN, accounts, transactions)</w:t>
+      </w:r>
+    </w:p>
+    <w:p>
+      <w:r>
+        <w:rPr>
+          <w:b/>
+        </w:rPr>
+        <w:t xml:space="preserve">4. </w:t>
+      </w:r>
+      <w:r>
+        <w:rPr>
+          <w:b/>
+        </w:rPr>
+        <w:t>BIG-IP's MCP iRule scans the structured JSON response, extracts PII from known field names, generates deterministic fakes, and stores bidirectional mappings in a session-keyed subtable. The response passes through unmodified so tool chaining works.</w:t>
+      </w:r>
+    </w:p>
+    <w:p>
+      <w:r>
+        <w:rPr>
+          <w:b/>
+        </w:rPr>
+        <w:t xml:space="preserve">5. </w:t>
+      </w:r>
+      <w:r>
+        <w:t>Open WebUI receives real data and composes a prompt</w:t>
+      </w:r>
+    </w:p>
+    <w:p>
+      <w:r>
+        <w:rPr>
+          <w:b/>
+        </w:rPr>
+        <w:t xml:space="preserve">6. </w:t>
+      </w:r>
+      <w:r>
+        <w:rPr>
+          <w:b/>
+        </w:rPr>
+        <w:t>When the prompt goes to the LLM through the BIG-IP Inference VS, the iRule uses [string map] to swap every real PII value with its fake counterpart</w:t>
+      </w:r>
+    </w:p>
+    <w:p>
+      <w:r>
+        <w:rPr>
+          <w:b/>
+        </w:rPr>
+        <w:t xml:space="preserve">7. </w:t>
+      </w:r>
+      <w:r>
+        <w:t>The LLM generates its response using fake data</w:t>
+      </w:r>
+    </w:p>
+    <w:p>
+      <w:r>
+        <w:rPr>
+          <w:b/>
+        </w:rPr>
+        <w:t xml:space="preserve">8. </w:t>
+      </w:r>
+      <w:r>
+        <w:rPr>
+          <w:b/>
+        </w:rPr>
+        <w:t>BIG-IP intercepts the response and swaps fakes back to reals. The analyst sees a report about John Doe with his real SSN and account numbers.</w:t>
+      </w:r>
+    </w:p>
+    <w:p>
+      <w:pPr>
+        <w:pStyle w:val="Heading2"/>
+      </w:pPr>
+      <w:r>
+        <w:t>Two Cloaking Modes</w:t>
+      </w:r>
+    </w:p>
+    <w:p>
+      <w:r>
+        <w:t xml:space="preserve">Context Cloak supports </w:t>
+      </w:r>
+      <w:r>
+        <w:rPr>
+          <w:b/>
+        </w:rPr>
+        <w:t>two modes</w:t>
+      </w:r>
+      <w:r>
+        <w:t>, configurable per PII field:</w:t>
       </w:r>
     </w:p>
     <w:p>
@@ -268,90 +739,85 @@
         <w:pStyle w:val="Heading3"/>
       </w:pPr>
       <w:r>
-        <w:t>The Data Flow</w:t>
+        <w:t>Substitute Mode</w:t>
+      </w:r>
+    </w:p>
+    <w:p>
+      <w:r>
+        <w:t xml:space="preserve">Replaces PII with </w:t>
+      </w:r>
+      <w:r>
+        <w:rPr>
+          <w:b/>
+        </w:rPr>
+        <w:t>realistic fake values</w:t>
+      </w:r>
+      <w:r>
+        <w:t xml:space="preserve">. Names come from a deterministic pool, numbers are digit-shifted, emails are derived. The LLM reasons about the data naturally because it </w:t>
+      </w:r>
+      <w:r>
+        <w:rPr>
+          <w:i/>
+        </w:rPr>
+        <w:t>looks real.</w:t>
       </w:r>
     </w:p>
     <w:p>
       <w:pPr>
-        <w:pStyle w:val="ListNumber"/>
+        <w:pStyle w:val="CodeBlock"/>
+        <w:shd w:val="clear" w:color="auto" w:fill="1E1E1E"/>
       </w:pPr>
       <w:r>
-        <w:t>1. An analyst asks a question in Open WebUI: "Look up John Doe and summarize his transactions."</w:t>
+        <w:rPr>
+          <w:rFonts w:ascii="Consolas" w:hAnsi="Consolas"/>
+          <w:color w:val="D4D4D4"/>
+          <w:sz w:val="18"/>
+        </w:rPr>
+        <w:t>John Doe        --&gt;  Maria Garcia       (name pool)</w:t>
+      </w:r>
+      <w:r>
+        <w:br/>
+      </w:r>
+      <w:r>
+        <w:rPr>
+          <w:rFonts w:ascii="Consolas" w:hAnsi="Consolas"/>
+          <w:color w:val="D4D4D4"/>
+          <w:sz w:val="18"/>
+        </w:rPr>
+        <w:t>078-05-1120     --&gt;  523-50-6675        (digit shift +5)</w:t>
+      </w:r>
+      <w:r>
+        <w:br/>
+      </w:r>
+      <w:r>
+        <w:rPr>
+          <w:rFonts w:ascii="Consolas" w:hAnsi="Consolas"/>
+          <w:color w:val="D4D4D4"/>
+          <w:sz w:val="18"/>
+        </w:rPr>
+        <w:t>4532-1189-0042  --&gt;  7865-4412-3375     (digit shift +3)</w:t>
+      </w:r>
+      <w:r>
+        <w:br/>
+      </w:r>
+      <w:r>
+        <w:rPr>
+          <w:rFonts w:ascii="Consolas" w:hAnsi="Consolas"/>
+          <w:color w:val="D4D4D4"/>
+          <w:sz w:val="18"/>
+        </w:rPr>
+        <w:t>john@email.com  --&gt;  maria.g@example.net (derived)</w:t>
       </w:r>
     </w:p>
     <w:p>
-      <w:pPr>
-        <w:pStyle w:val="ListNumber"/>
-      </w:pPr>
-      <w:r>
-        <w:t>2. Open WebUI calls MCP tools through the BIG-IP MCP Virtual Server.</w:t>
-      </w:r>
-    </w:p>
-    <w:p>
-      <w:pPr>
-        <w:pStyle w:val="ListNumber"/>
-      </w:pPr>
-      <w:r>
-        <w:t>3. The MCP server queries Postgres and returns real customer data -- name, SSN, accounts, transactions.</w:t>
-      </w:r>
-    </w:p>
-    <w:p>
-      <w:pPr>
-        <w:pStyle w:val="ListNumber"/>
-      </w:pPr>
-      <w:r>
-        <w:t>4. BIG-IP's MCP iRule scans the structured JSON response, extracts PII from known field names (full_name, ssn, account_number, etc.), generates deterministic fake values, and stores bidirectional mappings in a session-keyed subtable. The response passes through unmodified so tool chaining works.</w:t>
-      </w:r>
-    </w:p>
-    <w:p>
-      <w:pPr>
-        <w:pStyle w:val="ListNumber"/>
-      </w:pPr>
-      <w:r>
-        <w:t>5. Open WebUI receives real data and composes a prompt.</w:t>
-      </w:r>
-    </w:p>
-    <w:p>
-      <w:pPr>
-        <w:pStyle w:val="ListNumber"/>
-      </w:pPr>
-      <w:r>
-        <w:t>6. When the prompt goes to the LLM through the BIG-IP Inference Virtual Server, the iRule uses [string map] to swap every real PII value with its fake counterpart. The LLM sees "Maria Garcia" and "523-50-6675."</w:t>
-      </w:r>
-    </w:p>
-    <w:p>
-      <w:pPr>
-        <w:pStyle w:val="ListNumber"/>
-      </w:pPr>
-      <w:r>
-        <w:t>7. The LLM generates its response using fake data.</w:t>
-      </w:r>
-    </w:p>
-    <w:p>
-      <w:pPr>
-        <w:pStyle w:val="ListNumber"/>
-      </w:pPr>
-      <w:r>
-        <w:t>8. BIG-IP intercepts the response and swaps fakes back to reals. The analyst sees a report about John Doe with his real SSN and account numbers.</w:t>
-      </w:r>
-    </w:p>
-    <w:p/>
-    <w:p>
-      <w:pPr>
-        <w:pStyle w:val="Heading3"/>
-      </w:pPr>
-      <w:r>
-        <w:t>Why Substitution Works</w:t>
-      </w:r>
-    </w:p>
-    <w:p>
-      <w:r>
-        <w:t>The key insight is that the LLM's behavior is identical when processing fake data that looks real versus actual real data. "Maria Garcia" triggers the same report formatting, the same calculations, the same natural language generation as "John Doe." The model doesn't know and doesn't care -- it just processes the data it's given.</w:t>
-      </w:r>
-    </w:p>
-    <w:p>
-      <w:r>
-        <w:t>When I was thinking about this concept, my mind kept coming back to James Veitch's TED talk about messing with email scammers. Veitch tells the scammer they need to use a code for security: "Lawyer" becomes "Gummy Bear," "Bank" becomes "Cream Egg," "Documents" becomes "Jelly Beans," and "Western Union" becomes "A Giant Gummy Lizard." The scammer actually uses the code. He writes back: "I am trying to raise the balance for the Gummy Bear so he can submit all the needed Fizzy Cola Bottle Jelly Beans to the Creme Egg... Send 1,500 pounds via a Giant Gummy Lizard." The real transaction details -- the amounts, the urgency, the process -- all stayed intact. Only the sensitive terms were swapped. The scammer didn't even question it. That idea stuck with me -- what if we could do the same thing to protect PII from LLMs? But rotate the candy -- so it's not a static code book, but a fresh set of substitutions every session.</w:t>
+      <w:r>
+        <w:rPr>
+          <w:b/>
+        </w:rPr>
+        <w:t xml:space="preserve">Best for: </w:t>
+      </w:r>
+      <w:r>
+        <w:t>fields the LLM needs to reason about naturally -- names in reports, account numbers in summaries.</w:t>
       </w:r>
     </w:p>
     <w:p>
@@ -359,28 +825,90 @@
         <w:pStyle w:val="Heading3"/>
       </w:pPr>
       <w:r>
-        <w:t>Two Cloaking Modes</w:t>
+        <w:t>Tokenize Mode</w:t>
       </w:r>
     </w:p>
     <w:p>
       <w:r>
-        <w:t>Context Cloak supports two modes, configurable per PII field:</w:t>
+        <w:t xml:space="preserve">Replaces PII with </w:t>
+      </w:r>
+      <w:r>
+        <w:rPr>
+          <w:b/>
+        </w:rPr>
+        <w:t>structured placeholders</w:t>
+      </w:r>
+      <w:r>
+        <w:t>:</w:t>
       </w:r>
     </w:p>
     <w:p>
       <w:pPr>
-        <w:pStyle w:val="ListBullet"/>
+        <w:pStyle w:val="CodeBlock"/>
+        <w:shd w:val="clear" w:color="auto" w:fill="1E1E1E"/>
       </w:pPr>
       <w:r>
-        <w:t>Substitute mode: Replaces PII with realistic fake values. Names come from a deterministic pool, numbers are digit-shifted, emails are derived. Best for fields the LLM needs to reason about naturally.</w:t>
+        <w:rPr>
+          <w:rFonts w:ascii="Consolas" w:hAnsi="Consolas"/>
+          <w:color w:val="D4D4D4"/>
+          <w:sz w:val="18"/>
+        </w:rPr>
+        <w:t>078-05-1120     --&gt;  &lt;&lt;SSN:32.192.169.232:001&gt;&gt;</w:t>
+      </w:r>
+      <w:r>
+        <w:br/>
+      </w:r>
+      <w:r>
+        <w:rPr>
+          <w:rFonts w:ascii="Consolas" w:hAnsi="Consolas"/>
+          <w:color w:val="D4D4D4"/>
+          <w:sz w:val="18"/>
+        </w:rPr>
+        <w:t>John Doe        --&gt;  &lt;&lt;name:32.192.169.232:001&gt;&gt;</w:t>
+      </w:r>
+      <w:r>
+        <w:br/>
+      </w:r>
+      <w:r>
+        <w:rPr>
+          <w:rFonts w:ascii="Consolas" w:hAnsi="Consolas"/>
+          <w:color w:val="D4D4D4"/>
+          <w:sz w:val="18"/>
+        </w:rPr>
+        <w:t>4532-1189-0042  --&gt;  &lt;&lt;digit_shift:32.192.169.232:001&gt;&gt;</w:t>
       </w:r>
     </w:p>
     <w:p>
-      <w:pPr>
-        <w:pStyle w:val="ListBullet"/>
-      </w:pPr>
-      <w:r>
-        <w:t>Tokenize mode: Replaces PII with structured placeholders like &lt;&lt;SSN:session:001&gt;&gt;. This mode is designed for defense-in-depth scenarios where downstream guardrails (like F5 AI Guardrails) need to catch any leaked PII. The tokens are intentionally distinctive — if one slips through de-cloaking, a guardrails policy can pattern-match it. Note: smaller LLMs (7B parameters) may struggle to reproduce tokens verbatim — they sometimes strip brackets, hallucinate values, or refuse to display the placeholders. Larger models (14B+) handle tokenize mode reliably. Both modes can be mixed per field in the same request.</w:t>
+      <w:r>
+        <w:t xml:space="preserve">A </w:t>
+      </w:r>
+      <w:r>
+        <w:rPr>
+          <w:b/>
+        </w:rPr>
+        <w:t>guidance prompt</w:t>
+      </w:r>
+      <w:r>
+        <w:t xml:space="preserve"> is automatically injected into the LLM request, instructing it to reproduce the tokens exactly as-is. Larger models (14B+ parameters) handle this reliably; smaller models (7B) may struggle.</w:t>
+      </w:r>
+    </w:p>
+    <w:p>
+      <w:r>
+        <w:rPr>
+          <w:b/>
+        </w:rPr>
+        <w:t xml:space="preserve">Best for: </w:t>
+      </w:r>
+      <w:r>
+        <w:t>defense-in-depth with F5 AI Guardrails. The tokens are intentionally distinctive -- if one leaks through de-cloaking, a guardrails policy can catch it.</w:t>
+      </w:r>
+    </w:p>
+    <w:p>
+      <w:r>
+        <w:rPr>
+          <w:b/>
+        </w:rPr>
+        <w:t>Both modes can be mixed per-field in the same request.</w:t>
       </w:r>
     </w:p>
     <w:p>
@@ -393,123 +921,90 @@
     </w:p>
     <w:p>
       <w:r>
-        <w:t>Context Cloak is packaged as an iAppLX extension -- a deployable application on BIG-IP with a REST API and web-based configuration UI. When deployed, it creates all required BIG-IP objects: data groups for PII field configuration, dynamically-generated iRules, HTTP profiles (with rechunk for SSE/chunked responses), SSL profiles, pools, monitors, and virtual servers.</w:t>
+        <w:t>Context Cloak is packaged as an iAppLX extension -- a deployable application on BIG-IP with a REST API and web-based configuration UI. When deployed, it creates all required BIG-IP objects: data groups, iRules, HTTP profiles, SSL profiles, pools, monitors, and virtual servers.</w:t>
       </w:r>
     </w:p>
     <w:p>
       <w:r>
-        <w:t>The configuration UI lets an administrator:</w:t>
-      </w:r>
-    </w:p>
-    <w:p>
-      <w:pPr>
-        <w:pStyle w:val="ListBullet"/>
-      </w:pPr>
-      <w:r>
-        <w:t>Define MCP server and LLM endpoint connections</w:t>
-      </w:r>
-    </w:p>
-    <w:p>
-      <w:pPr>
-        <w:pStyle w:val="ListBullet"/>
-      </w:pPr>
-      <w:r>
-        <w:t>Select which JSON fields in MCP responses contain PII</w:t>
-      </w:r>
-    </w:p>
-    <w:p>
-      <w:pPr>
-        <w:pStyle w:val="ListBullet"/>
-      </w:pPr>
-      <w:r>
-        <w:t>Choose the cloaking mode per field (substitute or tokenize)</w:t>
-      </w:r>
-    </w:p>
-    <w:p>
-      <w:pPr>
-        <w:pStyle w:val="ListBullet"/>
-      </w:pPr>
-      <w:r>
-        <w:t>Configure session TTL and identification method</w:t>
-      </w:r>
-    </w:p>
-    <w:p>
-      <w:pPr>
-        <w:pStyle w:val="ListBullet"/>
-      </w:pPr>
-      <w:r>
-        <w:t>Deploy or undeploy the entire configuration with one click</w:t>
-      </w:r>
-    </w:p>
-    <w:p>
-      <w:pPr>
-        <w:pStyle w:val="ListBullet"/>
-      </w:pPr>
-      <w:r>
-        <w:t>View deployment results in real-time</w:t>
-      </w:r>
-    </w:p>
-    <w:p>
-      <w:r>
-        <w:t>The iRules are data-group-driven -- no PII field names are hardcoded. Change the data group (via the GUI), and the cloaking behavior changes instantly. This means Context Cloak works with any MCP server, not just the financial demo included in the project.</w:t>
-      </w:r>
-    </w:p>
-    <w:p>
-      <w:pPr>
-        <w:pStyle w:val="Heading2"/>
-      </w:pPr>
-      <w:r>
-        <w:t>Trust Boundaries</w:t>
+        <w:t xml:space="preserve">The </w:t>
+      </w:r>
+      <w:r>
+        <w:rPr>
+          <w:b/>
+        </w:rPr>
+        <w:t>PII Field Configuration</w:t>
+      </w:r>
+      <w:r>
+        <w:t xml:space="preserve"> is the core of Context Cloak. The admin selects which JSON fields in MCP responses contain PII and chooses the cloaking mode per field:</w:t>
       </w:r>
     </w:p>
     <w:tbl>
       <w:tblPr>
         <w:tblStyle w:val="LightGrid-Accent1"/>
         <w:tblW w:type="auto" w:w="0"/>
+        <w:jc w:val="center"/>
         <w:tblLook w:firstColumn="1" w:firstRow="1" w:lastColumn="0" w:lastRow="0" w:noHBand="0" w:noVBand="1" w:val="04A0"/>
       </w:tblPr>
       <w:tblGrid>
-        <w:gridCol w:w="2880"/>
-        <w:gridCol w:w="2880"/>
-        <w:gridCol w:w="2880"/>
+        <w:gridCol w:w="2160"/>
+        <w:gridCol w:w="2160"/>
+        <w:gridCol w:w="2160"/>
+        <w:gridCol w:w="2160"/>
       </w:tblGrid>
       <w:tr>
         <w:tc>
           <w:tcPr>
-            <w:tcW w:type="dxa" w:w="2880"/>
+            <w:tcW w:type="dxa" w:w="2160"/>
           </w:tcPr>
           <w:p>
             <w:r>
               <w:rPr>
                 <w:b/>
+                <w:sz w:val="20"/>
               </w:rPr>
-              <w:t>Zone</w:t>
+              <w:t>Field</w:t>
             </w:r>
           </w:p>
         </w:tc>
         <w:tc>
           <w:tcPr>
-            <w:tcW w:type="dxa" w:w="2880"/>
+            <w:tcW w:type="dxa" w:w="2160"/>
           </w:tcPr>
           <w:p>
             <w:r>
               <w:rPr>
                 <w:b/>
+                <w:sz w:val="20"/>
               </w:rPr>
-              <w:t>Components</w:t>
+              <w:t>Aliases</w:t>
             </w:r>
           </w:p>
         </w:tc>
         <w:tc>
           <w:tcPr>
-            <w:tcW w:type="dxa" w:w="2880"/>
+            <w:tcW w:type="dxa" w:w="2160"/>
           </w:tcPr>
           <w:p>
             <w:r>
               <w:rPr>
                 <w:b/>
+                <w:sz w:val="20"/>
               </w:rPr>
-              <w:t>Sees Real PII?</w:t>
+              <w:t>Mode</w:t>
+            </w:r>
+          </w:p>
+        </w:tc>
+        <w:tc>
+          <w:tcPr>
+            <w:tcW w:type="dxa" w:w="2160"/>
+          </w:tcPr>
+          <w:p>
+            <w:r>
+              <w:rPr>
+                <w:b/>
+                <w:sz w:val="20"/>
+              </w:rPr>
+              <w:t>Type / Label</w:t>
             </w:r>
           </w:p>
         </w:tc>
@@ -517,31 +1012,57 @@
       <w:tr>
         <w:tc>
           <w:tcPr>
-            <w:tcW w:type="dxa" w:w="2880"/>
+            <w:tcW w:type="dxa" w:w="2160"/>
           </w:tcPr>
           <w:p>
             <w:r>
-              <w:t>MCP Server + Database</w:t>
+              <w:rPr>
+                <w:rFonts w:ascii="Consolas" w:hAnsi="Consolas"/>
+                <w:sz w:val="20"/>
+              </w:rPr>
+              <w:t>full_name</w:t>
             </w:r>
           </w:p>
         </w:tc>
         <w:tc>
           <w:tcPr>
-            <w:tcW w:type="dxa" w:w="2880"/>
+            <w:tcW w:type="dxa" w:w="2160"/>
           </w:tcPr>
           <w:p>
             <w:r>
-              <w:t>Postgres, MCP tools</w:t>
+              <w:rPr>
+                <w:rFonts w:ascii="Consolas" w:hAnsi="Consolas"/>
+                <w:sz w:val="20"/>
+              </w:rPr>
+              <w:t>customer_name</w:t>
             </w:r>
           </w:p>
         </w:tc>
         <w:tc>
           <w:tcPr>
-            <w:tcW w:type="dxa" w:w="2880"/>
+            <w:tcW w:type="dxa" w:w="2160"/>
           </w:tcPr>
           <w:p>
             <w:r>
-              <w:t>Yes -- source of truth</w:t>
+              <w:rPr>
+                <w:rFonts w:ascii="Calibri" w:hAnsi="Calibri"/>
+                <w:sz w:val="20"/>
+              </w:rPr>
+              <w:t>Substitute</w:t>
+            </w:r>
+          </w:p>
+        </w:tc>
+        <w:tc>
+          <w:tcPr>
+            <w:tcW w:type="dxa" w:w="2160"/>
+          </w:tcPr>
+          <w:p>
+            <w:r>
+              <w:rPr>
+                <w:rFonts w:ascii="Calibri" w:hAnsi="Calibri"/>
+                <w:sz w:val="20"/>
+              </w:rPr>
+              <w:t>Name Pool</w:t>
             </w:r>
           </w:p>
         </w:tc>
@@ -549,31 +1070,56 @@
       <w:tr>
         <w:tc>
           <w:tcPr>
-            <w:tcW w:type="dxa" w:w="2880"/>
+            <w:tcW w:type="dxa" w:w="2160"/>
           </w:tcPr>
           <w:p>
             <w:r>
-              <w:t>BIG-IP (Enforcement)</w:t>
+              <w:rPr>
+                <w:rFonts w:ascii="Consolas" w:hAnsi="Consolas"/>
+                <w:sz w:val="20"/>
+              </w:rPr>
+              <w:t>ssn</w:t>
             </w:r>
           </w:p>
         </w:tc>
         <w:tc>
           <w:tcPr>
-            <w:tcW w:type="dxa" w:w="2880"/>
+            <w:tcW w:type="dxa" w:w="2160"/>
           </w:tcPr>
           <w:p>
             <w:r>
-              <w:t>MCP VS, Inference VS, Cloaking Table</w:t>
+              <w:rPr>
+                <w:rFonts w:ascii="Consolas" w:hAnsi="Consolas"/>
+                <w:sz w:val="20"/>
+              </w:rPr>
             </w:r>
           </w:p>
         </w:tc>
         <w:tc>
           <w:tcPr>
-            <w:tcW w:type="dxa" w:w="2880"/>
+            <w:tcW w:type="dxa" w:w="2160"/>
           </w:tcPr>
           <w:p>
             <w:r>
-              <w:t>Yes -- performs the swap</w:t>
+              <w:rPr>
+                <w:rFonts w:ascii="Calibri" w:hAnsi="Calibri"/>
+                <w:sz w:val="20"/>
+              </w:rPr>
+              <w:t>Tokenize</w:t>
+            </w:r>
+          </w:p>
+        </w:tc>
+        <w:tc>
+          <w:tcPr>
+            <w:tcW w:type="dxa" w:w="2160"/>
+          </w:tcPr>
+          <w:p>
+            <w:r>
+              <w:rPr>
+                <w:rFonts w:ascii="Calibri" w:hAnsi="Calibri"/>
+                <w:sz w:val="20"/>
+              </w:rPr>
+              <w:t>SSN</w:t>
             </w:r>
           </w:p>
         </w:tc>
@@ -581,31 +1127,56 @@
       <w:tr>
         <w:tc>
           <w:tcPr>
-            <w:tcW w:type="dxa" w:w="2880"/>
+            <w:tcW w:type="dxa" w:w="2160"/>
           </w:tcPr>
           <w:p>
             <w:r>
-              <w:t>Open WebUI</w:t>
+              <w:rPr>
+                <w:rFonts w:ascii="Consolas" w:hAnsi="Consolas"/>
+                <w:sz w:val="20"/>
+              </w:rPr>
+              <w:t>account_number</w:t>
             </w:r>
           </w:p>
         </w:tc>
         <w:tc>
           <w:tcPr>
-            <w:tcW w:type="dxa" w:w="2880"/>
+            <w:tcW w:type="dxa" w:w="2160"/>
           </w:tcPr>
           <w:p>
             <w:r>
-              <w:t>Chat UI, MCP orchestration</w:t>
+              <w:rPr>
+                <w:rFonts w:ascii="Consolas" w:hAnsi="Consolas"/>
+                <w:sz w:val="20"/>
+              </w:rPr>
             </w:r>
           </w:p>
         </w:tc>
         <w:tc>
           <w:tcPr>
-            <w:tcW w:type="dxa" w:w="2880"/>
+            <w:tcW w:type="dxa" w:w="2160"/>
           </w:tcPr>
           <w:p>
             <w:r>
-              <w:t>Yes -- receives real data from MCP</w:t>
+              <w:rPr>
+                <w:rFonts w:ascii="Calibri" w:hAnsi="Calibri"/>
+                <w:sz w:val="20"/>
+              </w:rPr>
+              <w:t>Substitute</w:t>
+            </w:r>
+          </w:p>
+        </w:tc>
+        <w:tc>
+          <w:tcPr>
+            <w:tcW w:type="dxa" w:w="2160"/>
+          </w:tcPr>
+          <w:p>
+            <w:r>
+              <w:rPr>
+                <w:rFonts w:ascii="Calibri" w:hAnsi="Calibri"/>
+                <w:sz w:val="20"/>
+              </w:rPr>
+              <w:t>Digit Shift</w:t>
             </w:r>
           </w:p>
         </w:tc>
@@ -613,34 +1184,113 @@
       <w:tr>
         <w:tc>
           <w:tcPr>
-            <w:tcW w:type="dxa" w:w="2880"/>
+            <w:tcW w:type="dxa" w:w="2160"/>
           </w:tcPr>
           <w:p>
             <w:r>
-              <w:t>LLM (Untrusted)</w:t>
+              <w:rPr>
+                <w:rFonts w:ascii="Consolas" w:hAnsi="Consolas"/>
+                <w:sz w:val="20"/>
+              </w:rPr>
+              <w:t>phone</w:t>
             </w:r>
           </w:p>
         </w:tc>
         <w:tc>
           <w:tcPr>
-            <w:tcW w:type="dxa" w:w="2880"/>
+            <w:tcW w:type="dxa" w:w="2160"/>
           </w:tcPr>
           <w:p>
             <w:r>
-              <w:t>vLLM / Qwen 2.5 7B</w:t>
+              <w:rPr>
+                <w:rFonts w:ascii="Consolas" w:hAnsi="Consolas"/>
+                <w:sz w:val="20"/>
+              </w:rPr>
             </w:r>
           </w:p>
         </w:tc>
         <w:tc>
           <w:tcPr>
-            <w:tcW w:type="dxa" w:w="2880"/>
+            <w:tcW w:type="dxa" w:w="2160"/>
           </w:tcPr>
           <w:p>
             <w:r>
               <w:rPr>
-                <w:b/>
+                <w:rFonts w:ascii="Calibri" w:hAnsi="Calibri"/>
+                <w:sz w:val="20"/>
               </w:rPr>
-              <w:t>NO -- only sees fake data</w:t>
+              <w:t>Substitute</w:t>
+            </w:r>
+          </w:p>
+        </w:tc>
+        <w:tc>
+          <w:tcPr>
+            <w:tcW w:type="dxa" w:w="2160"/>
+          </w:tcPr>
+          <w:p>
+            <w:r>
+              <w:rPr>
+                <w:rFonts w:ascii="Calibri" w:hAnsi="Calibri"/>
+                <w:sz w:val="20"/>
+              </w:rPr>
+              <w:t>Phone</w:t>
+            </w:r>
+          </w:p>
+        </w:tc>
+      </w:tr>
+      <w:tr>
+        <w:tc>
+          <w:tcPr>
+            <w:tcW w:type="dxa" w:w="2160"/>
+          </w:tcPr>
+          <w:p>
+            <w:r>
+              <w:rPr>
+                <w:rFonts w:ascii="Consolas" w:hAnsi="Consolas"/>
+                <w:sz w:val="20"/>
+              </w:rPr>
+              <w:t>email</w:t>
+            </w:r>
+          </w:p>
+        </w:tc>
+        <w:tc>
+          <w:tcPr>
+            <w:tcW w:type="dxa" w:w="2160"/>
+          </w:tcPr>
+          <w:p>
+            <w:r>
+              <w:rPr>
+                <w:rFonts w:ascii="Consolas" w:hAnsi="Consolas"/>
+                <w:sz w:val="20"/>
+              </w:rPr>
+            </w:r>
+          </w:p>
+        </w:tc>
+        <w:tc>
+          <w:tcPr>
+            <w:tcW w:type="dxa" w:w="2160"/>
+          </w:tcPr>
+          <w:p>
+            <w:r>
+              <w:rPr>
+                <w:rFonts w:ascii="Calibri" w:hAnsi="Calibri"/>
+                <w:sz w:val="20"/>
+              </w:rPr>
+              <w:t>Substitute</w:t>
+            </w:r>
+          </w:p>
+        </w:tc>
+        <w:tc>
+          <w:tcPr>
+            <w:tcW w:type="dxa" w:w="2160"/>
+          </w:tcPr>
+          <w:p>
+            <w:r>
+              <w:rPr>
+                <w:rFonts w:ascii="Calibri" w:hAnsi="Calibri"/>
+                <w:sz w:val="20"/>
+              </w:rPr>
+              <w:t>Email</w:t>
             </w:r>
           </w:p>
         </w:tc>
@@ -648,21 +1298,887 @@
     </w:tbl>
     <w:p/>
     <w:p>
+      <w:r>
+        <w:t xml:space="preserve">The iRules are </w:t>
+      </w:r>
+      <w:r>
+        <w:rPr>
+          <w:b/>
+        </w:rPr>
+        <w:t>data-group-driven</w:t>
+      </w:r>
+      <w:r>
+        <w:t xml:space="preserve"> -- no PII field names are hardcoded. Change the data group via the GUI, and the cloaking behavior changes instantly. This means Context Cloak works with </w:t>
+      </w:r>
+      <w:r>
+        <w:rPr>
+          <w:i/>
+        </w:rPr>
+        <w:t>any</w:t>
+      </w:r>
+      <w:r>
+        <w:t xml:space="preserve"> MCP server, not just the financial demo.</w:t>
+      </w:r>
+    </w:p>
+    <w:p>
       <w:pPr>
         <w:pStyle w:val="Heading2"/>
       </w:pPr>
       <w:r>
-        <w:t>What's Next: F5 AI Guardrails Integration</w:t>
+        <w:t>Live Demo</w:t>
       </w:r>
     </w:p>
     <w:p>
       <w:r>
-        <w:t>Context Cloak's tokenize mode is designed to complement F5 AI Guardrails. The &lt;&lt;TYPE:ID:SEQ&gt;&gt; format is intentionally distinctive -- if any token leaks through de-cloaking (because the LLM rephrased or reformatted it), a guardrails policy can catch it as a pattern match violation.</w:t>
+        <w:t>Enough theory -- here's what it looks like in practice.</w:t>
       </w:r>
     </w:p>
     <w:p>
-      <w:r>
-        <w:t>The vision: Context Cloak as the first layer of defense (PII never reaches the LLM), AI Guardrails as the safety net (catches anything that slips through). Defense in depth for AI data protection.</w:t>
+      <w:pPr>
+        <w:pStyle w:val="Heading3"/>
+      </w:pPr>
+      <w:r>
+        <w:t>Step 1: Install the RPM</w:t>
+      </w:r>
+    </w:p>
+    <w:p>
+      <w:pPr>
+        <w:jc w:val="center"/>
+      </w:pPr>
+      <w:r>
+        <w:rPr>
+          <w:b/>
+          <w:color w:val="0096FF"/>
+          <w:sz w:val="24"/>
+        </w:rPr>
+        <w:t>[ GIF: load_rpm.gif ]</w:t>
+      </w:r>
+    </w:p>
+    <w:p>
+      <w:pPr>
+        <w:jc w:val="center"/>
+      </w:pPr>
+      <w:r>
+        <w:rPr>
+          <w:i/>
+          <w:color w:val="808080"/>
+          <w:sz w:val="20"/>
+        </w:rPr>
+        <w:t>Installing Context Cloak via BIG-IP Package Management LX</w:t>
+      </w:r>
+    </w:p>
+    <w:p>
+      <w:pPr>
+        <w:pStyle w:val="Heading3"/>
+      </w:pPr>
+      <w:r>
+        <w:t>Step 2: Configure and Deploy</w:t>
+      </w:r>
+    </w:p>
+    <w:p>
+      <w:pPr>
+        <w:jc w:val="center"/>
+      </w:pPr>
+      <w:r>
+        <w:rPr>
+          <w:b/>
+          <w:color w:val="0096FF"/>
+          <w:sz w:val="24"/>
+        </w:rPr>
+        <w:t>[ GIF: context_cloak_deploy.gif ]</w:t>
+      </w:r>
+    </w:p>
+    <w:p>
+      <w:pPr>
+        <w:jc w:val="center"/>
+      </w:pPr>
+      <w:r>
+        <w:rPr>
+          <w:i/>
+          <w:color w:val="808080"/>
+          <w:sz w:val="20"/>
+        </w:rPr>
+        <w:t>Context Cloak GUI -- MCP server, LLM endpoint, PII fields, one-click deploy</w:t>
+      </w:r>
+    </w:p>
+    <w:p>
+      <w:pPr>
+        <w:jc w:val="center"/>
+      </w:pPr>
+      <w:r>
+        <w:rPr>
+          <w:b/>
+          <w:color w:val="0096FF"/>
+          <w:sz w:val="24"/>
+        </w:rPr>
+        <w:t>[ GIF: context_cloak_output.gif ]</w:t>
+      </w:r>
+    </w:p>
+    <w:p>
+      <w:pPr>
+        <w:jc w:val="center"/>
+      </w:pPr>
+      <w:r>
+        <w:rPr>
+          <w:i/>
+          <w:color w:val="808080"/>
+          <w:sz w:val="20"/>
+        </w:rPr>
+        <w:t>Deployment output showing session config and saved configuration</w:t>
+      </w:r>
+    </w:p>
+    <w:p>
+      <w:pPr>
+        <w:pStyle w:val="Heading3"/>
+      </w:pPr>
+      <w:r>
+        <w:t>Step 3: Verify Virtual Servers</w:t>
+      </w:r>
+    </w:p>
+    <w:p>
+      <w:pPr>
+        <w:jc w:val="center"/>
+      </w:pPr>
+      <w:r>
+        <w:rPr>
+          <w:b/>
+          <w:color w:val="0096FF"/>
+          <w:sz w:val="24"/>
+        </w:rPr>
+        <w:t>[ GIF: show_vs.gif ]</w:t>
+      </w:r>
+    </w:p>
+    <w:p>
+      <w:pPr>
+        <w:jc w:val="center"/>
+      </w:pPr>
+      <w:r>
+        <w:rPr>
+          <w:i/>
+          <w:color w:val="808080"/>
+          <w:sz w:val="20"/>
+        </w:rPr>
+        <w:t>BIG-IP Local Traffic showing MCP VS and Inference VS created by Context Cloak</w:t>
+      </w:r>
+    </w:p>
+    <w:p>
+      <w:pPr>
+        <w:pStyle w:val="Heading3"/>
+      </w:pPr>
+      <w:r>
+        <w:t>Step 4: Baseline -- No Cloaking</w:t>
+      </w:r>
+    </w:p>
+    <w:p>
+      <w:pPr>
+        <w:jc w:val="center"/>
+      </w:pPr>
+      <w:r>
+        <w:rPr>
+          <w:b/>
+          <w:color w:val="0096FF"/>
+          <w:sz w:val="24"/>
+        </w:rPr>
+        <w:t>[ GIF: test_no_cloak.gif ]</w:t>
+      </w:r>
+    </w:p>
+    <w:p>
+      <w:pPr>
+        <w:jc w:val="center"/>
+      </w:pPr>
+      <w:r>
+        <w:rPr>
+          <w:i/>
+          <w:color w:val="808080"/>
+          <w:sz w:val="20"/>
+        </w:rPr>
+        <w:t>Without Context Cloak: real PII flows directly to the LLM in cleartext</w:t>
+      </w:r>
+    </w:p>
+    <w:p>
+      <w:r>
+        <w:t xml:space="preserve">This is the </w:t>
+      </w:r>
+      <w:r>
+        <w:rPr>
+          <w:b/>
+        </w:rPr>
+        <w:t>"before"</w:t>
+      </w:r>
+      <w:r>
+        <w:t xml:space="preserve"> picture. The LLM sees everything: real names, real SSNs, real account numbers.</w:t>
+      </w:r>
+    </w:p>
+    <w:p>
+      <w:pPr>
+        <w:pStyle w:val="Heading3"/>
+      </w:pPr>
+      <w:r>
+        <w:t>Demo 1: Substitute Mode -- SSN Lookup</w:t>
+      </w:r>
+    </w:p>
+    <w:p>
+      <w:r>
+        <w:t xml:space="preserve">Prompt: </w:t>
+      </w:r>
+      <w:r>
+        <w:rPr>
+          <w:i/>
+        </w:rPr>
+        <w:t>"Show me the SSN number for John Doe. Just display the number."</w:t>
+      </w:r>
+    </w:p>
+    <w:p>
+      <w:pPr>
+        <w:jc w:val="center"/>
+      </w:pPr>
+      <w:r>
+        <w:rPr>
+          <w:b/>
+          <w:color w:val="0096FF"/>
+          <w:sz w:val="24"/>
+        </w:rPr>
+        <w:t>[ GIF: demo_cloak_substitution_ssn_john_doe.gif ]</w:t>
+      </w:r>
+    </w:p>
+    <w:p>
+      <w:pPr>
+        <w:jc w:val="center"/>
+      </w:pPr>
+      <w:r>
+        <w:rPr>
+          <w:i/>
+          <w:color w:val="808080"/>
+          <w:sz w:val="20"/>
+        </w:rPr>
+        <w:t>Substitute mode -- Open WebUI + Context Cloak GUI showing all fields as Substitute</w:t>
+      </w:r>
+    </w:p>
+    <w:p>
+      <w:r>
+        <w:rPr>
+          <w:b/>
+        </w:rPr>
+        <w:t xml:space="preserve">Result: </w:t>
+      </w:r>
+      <w:r>
+        <w:t xml:space="preserve">User sees real SSN </w:t>
+      </w:r>
+      <w:r>
+        <w:rPr>
+          <w:rFonts w:ascii="Consolas" w:hAnsi="Consolas"/>
+          <w:b/>
+        </w:rPr>
+        <w:t>078-05-1120</w:t>
+      </w:r>
+      <w:r>
+        <w:t>. LLM saw a digit-shifted fake.</w:t>
+      </w:r>
+    </w:p>
+    <w:p>
+      <w:pPr>
+        <w:pStyle w:val="Heading3"/>
+      </w:pPr>
+      <w:r>
+        <w:t>Demo 2: Substitute Mode -- Account Lookup</w:t>
+      </w:r>
+    </w:p>
+    <w:p>
+      <w:r>
+        <w:t xml:space="preserve">Prompt: </w:t>
+      </w:r>
+      <w:r>
+        <w:rPr>
+          <w:i/>
+        </w:rPr>
+        <w:t>"What accounts are associated to John Doe?"</w:t>
+      </w:r>
+    </w:p>
+    <w:p>
+      <w:pPr>
+        <w:jc w:val="center"/>
+      </w:pPr>
+      <w:r>
+        <w:rPr>
+          <w:b/>
+          <w:color w:val="0096FF"/>
+          <w:sz w:val="24"/>
+        </w:rPr>
+        <w:t>[ GIF: demo_cloak_substitution_accounts_john_doe.gif ]</w:t>
+      </w:r>
+    </w:p>
+    <w:p>
+      <w:pPr>
+        <w:jc w:val="center"/>
+      </w:pPr>
+      <w:r>
+        <w:rPr>
+          <w:i/>
+          <w:color w:val="808080"/>
+          <w:sz w:val="20"/>
+        </w:rPr>
+        <w:t>Left: Open WebUI with real data. Right: vLLM logs showing "Maria Garcia" with fake account numbers</w:t>
+      </w:r>
+    </w:p>
+    <w:p>
+      <w:r>
+        <w:rPr>
+          <w:b/>
+        </w:rPr>
+        <w:t>What the LLM saw:</w:t>
+      </w:r>
+    </w:p>
+    <w:p>
+      <w:pPr>
+        <w:pStyle w:val="CodeBlock"/>
+        <w:shd w:val="clear" w:color="auto" w:fill="1E1E1E"/>
+      </w:pPr>
+      <w:r>
+        <w:rPr>
+          <w:rFonts w:ascii="Consolas" w:hAnsi="Consolas"/>
+          <w:color w:val="D4D4D4"/>
+          <w:sz w:val="18"/>
+        </w:rPr>
+        <w:t>"customer_name": "Maria Garcia"</w:t>
+      </w:r>
+      <w:r>
+        <w:br/>
+      </w:r>
+      <w:r>
+        <w:rPr>
+          <w:rFonts w:ascii="Consolas" w:hAnsi="Consolas"/>
+          <w:color w:val="D4D4D4"/>
+          <w:sz w:val="18"/>
+        </w:rPr>
+        <w:t>"account_number": "7865-4412-3375"  (checking)</w:t>
+      </w:r>
+      <w:r>
+        <w:br/>
+      </w:r>
+      <w:r>
+        <w:rPr>
+          <w:rFonts w:ascii="Consolas" w:hAnsi="Consolas"/>
+          <w:color w:val="D4D4D4"/>
+          <w:sz w:val="18"/>
+        </w:rPr>
+        <w:t>"account_number": "7865-4412-3322"  (investment)</w:t>
+      </w:r>
+      <w:r>
+        <w:br/>
+      </w:r>
+      <w:r>
+        <w:rPr>
+          <w:rFonts w:ascii="Consolas" w:hAnsi="Consolas"/>
+          <w:color w:val="D4D4D4"/>
+          <w:sz w:val="18"/>
+        </w:rPr>
+        <w:t>"account_number": "7865-4412-3376"  (savings)</w:t>
+      </w:r>
+    </w:p>
+    <w:p>
+      <w:r>
+        <w:rPr>
+          <w:b/>
+        </w:rPr>
+        <w:t>What the user saw:</w:t>
+      </w:r>
+    </w:p>
+    <w:p>
+      <w:pPr>
+        <w:pStyle w:val="CodeBlock"/>
+        <w:shd w:val="clear" w:color="auto" w:fill="1E1E1E"/>
+      </w:pPr>
+      <w:r>
+        <w:rPr>
+          <w:rFonts w:ascii="Consolas" w:hAnsi="Consolas"/>
+          <w:color w:val="D4D4D4"/>
+          <w:sz w:val="18"/>
+        </w:rPr>
+        <w:t>Customer: John Doe</w:t>
+      </w:r>
+      <w:r>
+        <w:br/>
+      </w:r>
+      <w:r>
+        <w:rPr>
+          <w:rFonts w:ascii="Consolas" w:hAnsi="Consolas"/>
+          <w:color w:val="D4D4D4"/>
+          <w:sz w:val="18"/>
+        </w:rPr>
+        <w:t>Checking:   4532-1189-0042  --  $45,230.18</w:t>
+      </w:r>
+      <w:r>
+        <w:br/>
+      </w:r>
+      <w:r>
+        <w:rPr>
+          <w:rFonts w:ascii="Consolas" w:hAnsi="Consolas"/>
+          <w:color w:val="D4D4D4"/>
+          <w:sz w:val="18"/>
+        </w:rPr>
+        <w:t>Investment: 4532-1189-0099  --  $312,500.00</w:t>
+      </w:r>
+      <w:r>
+        <w:br/>
+      </w:r>
+      <w:r>
+        <w:rPr>
+          <w:rFonts w:ascii="Consolas" w:hAnsi="Consolas"/>
+          <w:color w:val="D4D4D4"/>
+          <w:sz w:val="18"/>
+        </w:rPr>
+        <w:t>Savings:    4532-1189-0043  --  $128,750.00</w:t>
+      </w:r>
+    </w:p>
+    <w:p>
+      <w:pPr>
+        <w:pStyle w:val="Heading3"/>
+      </w:pPr>
+      <w:r>
+        <w:t>Switching to Tokenize Mode</w:t>
+      </w:r>
+    </w:p>
+    <w:p>
+      <w:pPr>
+        <w:jc w:val="center"/>
+      </w:pPr>
+      <w:r>
+        <w:rPr>
+          <w:b/>
+          <w:color w:val="0096FF"/>
+          <w:sz w:val="24"/>
+        </w:rPr>
+        <w:t>[ GIF: context_cloak_change_to_tokenize.gif ]</w:t>
+      </w:r>
+    </w:p>
+    <w:p>
+      <w:pPr>
+        <w:jc w:val="center"/>
+      </w:pPr>
+      <w:r>
+        <w:rPr>
+          <w:i/>
+          <w:color w:val="808080"/>
+          <w:sz w:val="20"/>
+        </w:rPr>
+        <w:t>Changing PII fields from Substitute to Tokenize in the GUI</w:t>
+      </w:r>
+    </w:p>
+    <w:p>
+      <w:pPr>
+        <w:pStyle w:val="Heading3"/>
+      </w:pPr>
+      <w:r>
+        <w:t>Demo 3: Mixed Mode -- Tokenized SSN</w:t>
+      </w:r>
+    </w:p>
+    <w:p>
+      <w:r>
+        <w:t xml:space="preserve">SSN set to </w:t>
+      </w:r>
+      <w:r>
+        <w:rPr>
+          <w:b/>
+        </w:rPr>
+        <w:t>Tokenize</w:t>
+      </w:r>
+      <w:r>
+        <w:t xml:space="preserve">, name set to </w:t>
+      </w:r>
+      <w:r>
+        <w:rPr>
+          <w:b/>
+        </w:rPr>
+        <w:t>Substitute</w:t>
+      </w:r>
+      <w:r>
+        <w:t>.</w:t>
+      </w:r>
+    </w:p>
+    <w:p>
+      <w:r>
+        <w:t xml:space="preserve">Prompt: </w:t>
+      </w:r>
+      <w:r>
+        <w:rPr>
+          <w:i/>
+        </w:rPr>
+        <w:t>"Show me the SSN number for Jane Smith. Just display the number."</w:t>
+      </w:r>
+    </w:p>
+    <w:p>
+      <w:pPr>
+        <w:jc w:val="center"/>
+      </w:pPr>
+      <w:r>
+        <w:rPr>
+          <w:b/>
+          <w:color w:val="0096FF"/>
+          <w:sz w:val="24"/>
+        </w:rPr>
+        <w:t>[ GIF: context_cload_tokenize_ssn_jane_smith.gif ]</w:t>
+      </w:r>
+    </w:p>
+    <w:p>
+      <w:pPr>
+        <w:jc w:val="center"/>
+      </w:pPr>
+      <w:r>
+        <w:rPr>
+          <w:i/>
+          <w:color w:val="808080"/>
+          <w:sz w:val="20"/>
+        </w:rPr>
+        <w:t>Mixed mode -- real SSN de-cloaked on left, &lt;&lt;SSN:...&gt;&gt; token visible in vLLM logs on right</w:t>
+      </w:r>
+    </w:p>
+    <w:p>
+      <w:r>
+        <w:rPr>
+          <w:b/>
+        </w:rPr>
+        <w:t>What the LLM saw:</w:t>
+      </w:r>
+    </w:p>
+    <w:p>
+      <w:pPr>
+        <w:pStyle w:val="CodeBlock"/>
+        <w:shd w:val="clear" w:color="auto" w:fill="1E1E1E"/>
+      </w:pPr>
+      <w:r>
+        <w:rPr>
+          <w:rFonts w:ascii="Consolas" w:hAnsi="Consolas"/>
+          <w:color w:val="D4D4D4"/>
+          <w:sz w:val="18"/>
+        </w:rPr>
+        <w:t>"customer_name": "Maria Thompson"</w:t>
+      </w:r>
+      <w:r>
+        <w:br/>
+      </w:r>
+      <w:r>
+        <w:rPr>
+          <w:rFonts w:ascii="Consolas" w:hAnsi="Consolas"/>
+          <w:color w:val="D4D4D4"/>
+          <w:sz w:val="18"/>
+        </w:rPr>
+        <w:t>"ssn": "&lt;&lt;SSN:32.192.169.232:001&gt;&gt;"</w:t>
+      </w:r>
+    </w:p>
+    <w:p>
+      <w:r>
+        <w:rPr>
+          <w:b/>
+        </w:rPr>
+        <w:t xml:space="preserve">What the user saw: </w:t>
+      </w:r>
+      <w:r>
+        <w:t xml:space="preserve">Jane Smith, SSN </w:t>
+      </w:r>
+      <w:r>
+        <w:rPr>
+          <w:rFonts w:ascii="Consolas" w:hAnsi="Consolas"/>
+          <w:b/>
+        </w:rPr>
+        <w:t>219-09-9999</w:t>
+      </w:r>
+    </w:p>
+    <w:p>
+      <w:r>
+        <w:rPr>
+          <w:i/>
+        </w:rPr>
+        <w:t>Both modes operating on the same customer record, in the same request.</w:t>
+      </w:r>
+    </w:p>
+    <w:p>
+      <w:pPr>
+        <w:pStyle w:val="Heading3"/>
+      </w:pPr>
+      <w:r>
+        <w:t>Demo 4: Full Tokenize -- The Punchline</w:t>
+      </w:r>
+    </w:p>
+    <w:p>
+      <w:r>
+        <w:rPr>
+          <w:b/>
+        </w:rPr>
+        <w:t>ALL</w:t>
+      </w:r>
+      <w:r>
+        <w:t xml:space="preserve"> fields set to Tokenize mode.</w:t>
+      </w:r>
+    </w:p>
+    <w:p>
+      <w:r>
+        <w:t xml:space="preserve">Prompt: </w:t>
+      </w:r>
+      <w:r>
+        <w:rPr>
+          <w:i/>
+        </w:rPr>
+        <w:t>"Show me the SSN and account information for Carlos Rivera. Display all the numbers."</w:t>
+      </w:r>
+    </w:p>
+    <w:p>
+      <w:pPr>
+        <w:jc w:val="center"/>
+      </w:pPr>
+      <w:r>
+        <w:rPr>
+          <w:b/>
+          <w:color w:val="0096FF"/>
+          <w:sz w:val="24"/>
+        </w:rPr>
+        <w:t>[ GIF: context_cloak_tokenize_accounts_jane_smith.gif ]</w:t>
+      </w:r>
+    </w:p>
+    <w:p>
+      <w:pPr>
+        <w:jc w:val="center"/>
+      </w:pPr>
+      <w:r>
+        <w:rPr>
+          <w:i/>
+          <w:color w:val="808080"/>
+          <w:sz w:val="20"/>
+        </w:rPr>
+        <w:t>Full tokenize -- every PII field as a token, all de-cloaked on return</w:t>
+      </w:r>
+    </w:p>
+    <w:p>
+      <w:r>
+        <w:rPr>
+          <w:b/>
+        </w:rPr>
+        <w:t>What the LLM saw -- every PII field was a token:</w:t>
+      </w:r>
+    </w:p>
+    <w:p>
+      <w:pPr>
+        <w:pStyle w:val="CodeBlock"/>
+        <w:shd w:val="clear" w:color="auto" w:fill="1E1E1E"/>
+      </w:pPr>
+      <w:r>
+        <w:rPr>
+          <w:rFonts w:ascii="Consolas" w:hAnsi="Consolas"/>
+          <w:color w:val="D4D4D4"/>
+          <w:sz w:val="18"/>
+        </w:rPr>
+        <w:t>"full_name":       "&lt;&lt;name:32.192.169.232:001&gt;&gt;"</w:t>
+      </w:r>
+      <w:r>
+        <w:br/>
+      </w:r>
+      <w:r>
+        <w:rPr>
+          <w:rFonts w:ascii="Consolas" w:hAnsi="Consolas"/>
+          <w:color w:val="D4D4D4"/>
+          <w:sz w:val="18"/>
+        </w:rPr>
+        <w:t>"ssn":             "&lt;&lt;SSN:32.192.169.232:002&gt;&gt;"</w:t>
+      </w:r>
+      <w:r>
+        <w:br/>
+      </w:r>
+      <w:r>
+        <w:rPr>
+          <w:rFonts w:ascii="Consolas" w:hAnsi="Consolas"/>
+          <w:color w:val="D4D4D4"/>
+          <w:sz w:val="18"/>
+        </w:rPr>
+        <w:t>"phone":           "&lt;&lt;phone:32.192.169.232:002&gt;&gt;"</w:t>
+      </w:r>
+      <w:r>
+        <w:br/>
+      </w:r>
+      <w:r>
+        <w:rPr>
+          <w:rFonts w:ascii="Consolas" w:hAnsi="Consolas"/>
+          <w:color w:val="D4D4D4"/>
+          <w:sz w:val="18"/>
+        </w:rPr>
+        <w:t>"email":           "&lt;&lt;email:32.192.169.232:001&gt;&gt;"</w:t>
+      </w:r>
+      <w:r>
+        <w:br/>
+      </w:r>
+      <w:r>
+        <w:rPr>
+          <w:rFonts w:ascii="Consolas" w:hAnsi="Consolas"/>
+          <w:color w:val="D4D4D4"/>
+          <w:sz w:val="18"/>
+        </w:rPr>
+        <w:t>"account_number":  "&lt;&lt;digit_shift:32.192.169.232:002&gt;&gt;"  (checking)</w:t>
+      </w:r>
+      <w:r>
+        <w:br/>
+      </w:r>
+      <w:r>
+        <w:rPr>
+          <w:rFonts w:ascii="Consolas" w:hAnsi="Consolas"/>
+          <w:color w:val="D4D4D4"/>
+          <w:sz w:val="18"/>
+        </w:rPr>
+        <w:t>"account_number":  "&lt;&lt;digit_shift:32.192.169.232:003&gt;&gt;"  (investment)</w:t>
+      </w:r>
+      <w:r>
+        <w:br/>
+      </w:r>
+      <w:r>
+        <w:rPr>
+          <w:rFonts w:ascii="Consolas" w:hAnsi="Consolas"/>
+          <w:color w:val="D4D4D4"/>
+          <w:sz w:val="18"/>
+        </w:rPr>
+        <w:t>"account_number":  "&lt;&lt;digit_shift:32.192.169.232:004&gt;&gt;"  (savings)</w:t>
+      </w:r>
+    </w:p>
+    <w:p>
+      <w:r>
+        <w:rPr>
+          <w:b/>
+        </w:rPr>
+        <w:t>What the user saw -- all real data restored:</w:t>
+      </w:r>
+    </w:p>
+    <w:p>
+      <w:pPr>
+        <w:pStyle w:val="CodeBlock"/>
+        <w:shd w:val="clear" w:color="auto" w:fill="1E1E1E"/>
+      </w:pPr>
+      <w:r>
+        <w:rPr>
+          <w:rFonts w:ascii="Consolas" w:hAnsi="Consolas"/>
+          <w:color w:val="D4D4D4"/>
+          <w:sz w:val="18"/>
+        </w:rPr>
+        <w:t>Name:        Carlos Rivera</w:t>
+      </w:r>
+      <w:r>
+        <w:br/>
+      </w:r>
+      <w:r>
+        <w:rPr>
+          <w:rFonts w:ascii="Consolas" w:hAnsi="Consolas"/>
+          <w:color w:val="D4D4D4"/>
+          <w:sz w:val="18"/>
+        </w:rPr>
+        <w:t>SSN:         323-45-6789</w:t>
+      </w:r>
+      <w:r>
+        <w:br/>
+      </w:r>
+      <w:r>
+        <w:rPr>
+          <w:rFonts w:ascii="Consolas" w:hAnsi="Consolas"/>
+          <w:color w:val="D4D4D4"/>
+          <w:sz w:val="18"/>
+        </w:rPr>
+        <w:t>Checking:    6789-3345-0022  --  $89,120.45</w:t>
+      </w:r>
+      <w:r>
+        <w:br/>
+      </w:r>
+      <w:r>
+        <w:rPr>
+          <w:rFonts w:ascii="Consolas" w:hAnsi="Consolas"/>
+          <w:color w:val="D4D4D4"/>
+          <w:sz w:val="18"/>
+        </w:rPr>
+        <w:t>Investment:  6789-3345-0024  --  $890,000.00</w:t>
+      </w:r>
+      <w:r>
+        <w:br/>
+      </w:r>
+      <w:r>
+        <w:rPr>
+          <w:rFonts w:ascii="Consolas" w:hAnsi="Consolas"/>
+          <w:color w:val="D4D4D4"/>
+          <w:sz w:val="18"/>
+        </w:rPr>
+        <w:t>Savings:     6789-3345-0023  --  $245,000.00</w:t>
+      </w:r>
+    </w:p>
+    <w:p/>
+    <w:p>
+      <w:r>
+        <w:t>And here's the best part. Qwen's last line in the response:</w:t>
+      </w:r>
+    </w:p>
+    <w:p>
+      <w:r>
+        <w:rPr>
+          <w:i/>
+        </w:rPr>
+        <w:t>"Please note that the actual numerical values for the SSN and account numbers are masked due to privacy concerns."</w:t>
+      </w:r>
+    </w:p>
+    <w:p/>
+    <w:p>
+      <w:r>
+        <w:rPr>
+          <w:b/>
+        </w:rPr>
+        <w:t>The LLM genuinely believed it showed the user masked data.</w:t>
+      </w:r>
+      <w:r>
+        <w:t xml:space="preserve"> It apologized for the "privacy masking" -- not knowing that BIG-IP had already de-cloaked every token back to the real values. The user saw the full, real, unmasked report.</w:t>
+      </w:r>
+    </w:p>
+    <w:p>
+      <w:pPr>
+        <w:pStyle w:val="Heading2"/>
+      </w:pPr>
+      <w:r>
+        <w:t>What's Next: F5 AI Guardrails Integration</w:t>
+      </w:r>
+    </w:p>
+    <w:p>
+      <w:r>
+        <w:t xml:space="preserve">Context Cloak's tokenize mode is designed to complement </w:t>
+      </w:r>
+      <w:r>
+        <w:rPr>
+          <w:b/>
+        </w:rPr>
+        <w:t>F5 AI Guardrails</w:t>
+      </w:r>
+      <w:r>
+        <w:t xml:space="preserve">. The </w:t>
+      </w:r>
+      <w:r>
+        <w:rPr>
+          <w:rFonts w:ascii="Consolas" w:hAnsi="Consolas"/>
+        </w:rPr>
+        <w:t>&lt;&lt;TYPE:ID:SEQ&gt;&gt;</w:t>
+      </w:r>
+      <w:r>
+        <w:t xml:space="preserve"> format is intentionally distinctive -- if any token leaks through de-cloaking, a guardrails policy can catch it as a pattern match violation.</w:t>
+      </w:r>
+    </w:p>
+    <w:p>
+      <w:r>
+        <w:t xml:space="preserve">The vision: </w:t>
+      </w:r>
+      <w:r>
+        <w:rPr>
+          <w:b/>
+        </w:rPr>
+        <w:t>Context Cloak as the first layer of defense</w:t>
+      </w:r>
+      <w:r>
+        <w:t xml:space="preserve"> (PII never reaches the LLM), </w:t>
+      </w:r>
+      <w:r>
+        <w:rPr>
+          <w:b/>
+        </w:rPr>
+        <w:t>AI Guardrails as the safety net</w:t>
+      </w:r>
+      <w:r>
+        <w:t xml:space="preserve"> (catches anything that slips through). Defense in depth for AI data protection.</w:t>
       </w:r>
     </w:p>
     <w:p>
@@ -675,7 +2191,7 @@
         <w:pStyle w:val="ListBullet"/>
       </w:pPr>
       <w:r>
-        <w:t>Hostname-based LLM routing -- BIG-IP as a model gateway, routing to different LLM backends based on hostname with per-route cloaking policies</w:t>
+        <w:t>Hostname-based LLM routing -- BIG-IP as a model gateway with per-route cloaking policies</w:t>
       </w:r>
     </w:p>
     <w:p>
@@ -683,7 +2199,7 @@
         <w:pStyle w:val="ListBullet"/>
       </w:pPr>
       <w:r>
-        <w:t>JSON profile integration -- using BIG-IP's native JSON DOM parsing instead of regex for field extraction</w:t>
+        <w:t>JSON profile integration -- native BIG-IP JSON DOM parsing instead of regex</w:t>
       </w:r>
     </w:p>
     <w:p>
@@ -691,7 +2207,7 @@
         <w:pStyle w:val="ListBullet"/>
       </w:pPr>
       <w:r>
-        <w:t>Auto-discovery of MCP tool schemas -- connecting to the MCP server's tools/list endpoint to present available fields in the GUI</w:t>
+        <w:t>Auto-discovery of MCP tool schemas for PII field detection</w:t>
       </w:r>
     </w:p>
     <w:p>
@@ -704,10 +2220,33 @@
     </w:p>
     <w:p>
       <w:pPr>
-        <w:pStyle w:val="ListBullet"/>
+        <w:pStyle w:val="Heading2"/>
       </w:pPr>
       <w:r>
-        <w:t>Telemetry and audit logging for compliance reporting</w:t>
+        <w:t>Try It Yourself</w:t>
+      </w:r>
+    </w:p>
+    <w:p>
+      <w:r>
+        <w:t>The complete project is open source:</w:t>
+      </w:r>
+    </w:p>
+    <w:p>
+      <w:pPr>
+        <w:jc w:val="center"/>
+      </w:pPr>
+      <w:r>
+        <w:rPr>
+          <w:b/>
+          <w:color w:val="0064C8"/>
+          <w:sz w:val="26"/>
+        </w:rPr>
+        <w:t>https://github.com/j2rsolutions/f5_mcp_context_cloak</w:t>
+      </w:r>
+    </w:p>
+    <w:p>
+      <w:r>
+        <w:t>The repository includes Terraform for AWS infrastructure, Kubernetes manifests, the iAppLX package (RPM available in Releases), iRules, sample financial data, a test script, comprehensive documentation, and a full demo walkthrough with GIFs (see docs/demo-evidence.md).</w:t>
       </w:r>
     </w:p>
     <w:p>
@@ -715,27 +2254,42 @@
         <w:pStyle w:val="Heading2"/>
       </w:pPr>
       <w:r>
-        <w:t>Try It Yourself</w:t>
+        <w:t>A Note on Production Readiness</w:t>
       </w:r>
     </w:p>
     <w:p>
       <w:r>
-        <w:t>The complete project is open source and available on GitHub:</w:t>
+        <w:t xml:space="preserve">I want to be clear: </w:t>
+      </w:r>
+      <w:r>
+        <w:rPr>
+          <w:b/>
+        </w:rPr>
+        <w:t>this is a lab proof-of-concept.</w:t>
+      </w:r>
+      <w:r>
+        <w:t xml:space="preserve"> I have not tested this in a production environment. The cloaking subtable stores PII in BIG-IP memory, the fake name pool is small (100 combinations), the SSL certificates are self-signed, and there's no authentication on the MCP server. There are edge cases around streaming responses, subtable TTL expiry, and LLM-derived values that need more work.</w:t>
       </w:r>
     </w:p>
     <w:p>
       <w:r>
+        <w:t>But the core concept is proven: BIG-IP can transparently cloak PII in LLM workflows using value substitution and tokenization, and the iAppLX packaging makes it deployable and configurable without touching iRule code.</w:t>
+      </w:r>
+    </w:p>
+    <w:p>
+      <w:r>
         <w:rPr>
           <w:b/>
-          <w:color w:val="0066CC"/>
         </w:rPr>
-        <w:t>https://github.com/j2rsolutions/f5_mcp_context_cloak</w:t>
+        <w:t>I'd love to hear what the community thinks.</w:t>
+      </w:r>
+      <w:r>
+        <w:t xml:space="preserve"> Is this approach viable for your use cases? What PII types would you need to support? How would you handle the edge cases? What would it take to make this production-ready for your environment?</w:t>
       </w:r>
     </w:p>
-    <w:p/>
     <w:p>
       <w:r>
-        <w:t>The repository includes everything you need: Terraform for AWS infrastructure, Kubernetes manifests for the MCP server and Postgres, the iAppLX package, iRules, sample financial data, a test script, comprehensive documentation, and a full demo walkthrough with GIFs showing the cloaking pipeline in action (see docs/demo-evidence.md).</w:t>
+        <w:t>Let me know in the comments -- and if you want to contribute, PRs are welcome!</w:t>
       </w:r>
     </w:p>
     <w:p>
@@ -743,387 +2297,47 @@
         <w:pStyle w:val="Heading2"/>
       </w:pPr>
       <w:r>
-        <w:t>A Note on Production Readiness</w:t>
-      </w:r>
-    </w:p>
-    <w:p>
-      <w:r>
-        <w:t>I want to be clear: this is a lab proof-of-concept. I have not tested this in a production environment. The cloaking subtable stores PII in BIG-IP memory, the fake name pool is small (100 combinations), the SSL certificates are self-signed, and there's no authentication on the MCP server. There are edge cases around streaming responses, subtable TTL expiry, and LLM-derived values that need more work.</w:t>
-      </w:r>
-    </w:p>
-    <w:p>
-      <w:r>
-        <w:t>But the core concept is proven: BIG-IP can transparently cloak PII in LLM workflows using value substitution, and the iAppLX packaging makes it deployable and configurable without touching iRule code.</w:t>
-      </w:r>
-    </w:p>
-    <w:p>
-      <w:r>
-        <w:t>I'd love to hear what the community thinks. Is this approach viable for your use cases? What PII types would you need to support? How would you handle the edge cases? What would it take to make this production-ready for your environment?</w:t>
-      </w:r>
-    </w:p>
-    <w:p>
-      <w:r>
-        <w:t>Let me know in the comments -- and if you want to contribute, PRs are welcome!</w:t>
+        <w:t>Demo Environment</w:t>
       </w:r>
     </w:p>
     <w:p>
       <w:pPr>
-        <w:pStyle w:val="Heading2"/>
+        <w:pStyle w:val="ListBullet"/>
       </w:pPr>
       <w:r>
-        <w:t>Live Demo: Seeing It in Action</w:t>
-      </w:r>
-    </w:p>
-    <w:p>
-      <w:r>
-        <w:t>Enough theory -- let me show you what this actually looks like. I ran three demos through the full pipeline: Open WebUI → BIG-IP MCP VS → MCP Server → Postgres → back through BIG-IP → Qwen 2.5 14B → BIG-IP de-cloak → user sees real data.</w:t>
+        <w:t>F5 BIG-IP VE v21.0.0.1 on AWS (m5.xlarge)</w:t>
       </w:r>
     </w:p>
     <w:p>
       <w:pPr>
-        <w:pStyle w:val="Heading3"/>
+        <w:pStyle w:val="ListBullet"/>
       </w:pPr>
       <w:r>
-        <w:t>Demo 1: Substitute Mode — Account Lookup</w:t>
-      </w:r>
-    </w:p>
-    <w:p>
-      <w:r>
-        <w:t>I asked: "What accounts are associated to John Doe?"</w:t>
+        <w:t>Qwen 2.5 14B Instruct AWQ on vLLM 0.8.5 (NVIDIA L4, 24GB VRAM)</w:t>
       </w:r>
     </w:p>
     <w:p>
       <w:pPr>
-        <w:jc w:val="center"/>
+        <w:pStyle w:val="ListBullet"/>
       </w:pPr>
       <w:r>
-        <w:rPr>
-          <w:b/>
-          <w:color w:val="0066CC"/>
-        </w:rPr>
-        <w:t>[GIF: docs/gifs/demo_cloak_substitution_accounts_john_doe.gif]</w:t>
-        <w:br/>
-        <w:t>Open WebUI shows John Doe with real account numbers. vLLM logs show "Maria Garcia" with fake account numbers. The LLM never saw the real data.</w:t>
-      </w:r>
-    </w:p>
-    <w:p>
-      <w:r>
-        <w:t>What the LLM received (from vLLM server logs):</w:t>
+        <w:t>MCP Server: FastMCP 1.26 + PostgreSQL 16 on Kubernetes (RKE2)</w:t>
       </w:r>
     </w:p>
     <w:p>
       <w:pPr>
-        <w:pStyle w:val="NoSpacing"/>
+        <w:pStyle w:val="ListBullet"/>
       </w:pPr>
       <w:r>
-        <w:t xml:space="preserve">  customer_name: "Maria Garcia"</w:t>
-        <w:br/>
-        <w:t xml:space="preserve">  account_number: "7865-4412-3375" (checking)</w:t>
-        <w:br/>
-        <w:t xml:space="preserve">  account_number: "7865-4412-3322" (investment)</w:t>
-        <w:br/>
-        <w:t xml:space="preserve">  account_number: "7865-4412-3376" (savings)</w:t>
-      </w:r>
-    </w:p>
-    <w:p>
-      <w:r>
-        <w:t>What the user saw in Open WebUI:</w:t>
+        <w:t>Open WebUI v0.8.10</w:t>
       </w:r>
     </w:p>
     <w:p>
       <w:pPr>
-        <w:pStyle w:val="NoSpacing"/>
+        <w:pStyle w:val="ListBullet"/>
       </w:pPr>
       <w:r>
-        <w:t xml:space="preserve">  Customer: John Doe</w:t>
-        <w:br/>
-        <w:t xml:space="preserve">  Account: 4532-1189-0042 (checking) — $45,230.18</w:t>
-        <w:br/>
-        <w:t xml:space="preserve">  Account: 4532-1189-0099 (investment) — $312,500.00</w:t>
-        <w:br/>
-        <w:t xml:space="preserve">  Account: 4532-1189-0043 (savings) — $128,750.00</w:t>
-      </w:r>
-    </w:p>
-    <w:p>
-      <w:r>
-        <w:t>The LLM generated a perfect account summary for "Maria Garcia" — formatting, balances, account types — all correct. It had no idea it was looking at fake data. BIG-IP swapped everything back on the return trip.</w:t>
-      </w:r>
-    </w:p>
-    <w:p>
-      <w:pPr>
-        <w:pStyle w:val="Heading3"/>
-      </w:pPr>
-      <w:r>
-        <w:t>Demo 2: Mixed Mode — Tokenized SSN</w:t>
-      </w:r>
-    </w:p>
-    <w:p>
-      <w:r>
-        <w:t>I asked: "Show me the SSN number for Jane Smith. Just display the number."</w:t>
-        <w:br/>
-        <w:br/>
-        <w:t>SSN was set to tokenize mode, name to substitute.</w:t>
-      </w:r>
-    </w:p>
-    <w:p>
-      <w:pPr>
-        <w:jc w:val="center"/>
-      </w:pPr>
-      <w:r>
-        <w:rPr>
-          <w:b/>
-          <w:color w:val="0066CC"/>
-        </w:rPr>
-        <w:t>[GIF: docs/gifs/context_cload_tokenize_ssn_jane_smith.gif]</w:t>
-        <w:br/>
-        <w:t>Open WebUI shows Jane Smith SSN 219-09-9999. vLLM logs show "Maria Thompson" with &lt;&lt;SSN:32.192.169.232:001&gt;&gt;. Mixed substitute + tokenize in the same request.</w:t>
-      </w:r>
-    </w:p>
-    <w:p>
-      <w:r>
-        <w:t>What the LLM received:</w:t>
-      </w:r>
-    </w:p>
-    <w:p>
-      <w:pPr>
-        <w:pStyle w:val="NoSpacing"/>
-      </w:pPr>
-      <w:r>
-        <w:t xml:space="preserve">  customer_name: "Maria Thompson"</w:t>
-        <w:br/>
-        <w:t xml:space="preserve">  ssn: "&lt;&lt;SSN:32.192.169.232:001&gt;&gt;"</w:t>
-      </w:r>
-    </w:p>
-    <w:p>
-      <w:r>
-        <w:t>What the user saw: "The SSN given is 219-09-9999"</w:t>
-        <w:br/>
-        <w:br/>
-        <w:t>The name was substituted (Jane Smith → Maria Thompson) and the SSN was tokenized. Both modes operating on the same customer record, in the same request.</w:t>
-      </w:r>
-    </w:p>
-    <w:p>
-      <w:pPr>
-        <w:pStyle w:val="Heading3"/>
-      </w:pPr>
-      <w:r>
-        <w:t>Demo 3: Full Tokenize — The Punchline</w:t>
-      </w:r>
-    </w:p>
-    <w:p>
-      <w:r>
-        <w:t>I set ALL fields to tokenize mode and asked: "Show me the SSN and account information for Carlos Rivera. Display all the numbers."</w:t>
-      </w:r>
-    </w:p>
-    <w:p>
-      <w:pPr>
-        <w:jc w:val="center"/>
-      </w:pPr>
-      <w:r>
-        <w:rPr>
-          <w:b/>
-          <w:color w:val="0066CC"/>
-        </w:rPr>
-        <w:t>[GIF: docs/gifs/context_cloak_tokenize_accounts_jane_smith.gif]</w:t>
-        <w:br/>
-        <w:t>Open WebUI shows Carlos Rivera with all real data. vLLM logs show every field as &lt;&lt;TYPE:SESSION:SEQ&gt;&gt; tokens. The LLM even apologized for the "masked" data.</w:t>
-      </w:r>
-    </w:p>
-    <w:p>
-      <w:r>
-        <w:t>What the LLM received — every PII field was a token:</w:t>
-      </w:r>
-    </w:p>
-    <w:p>
-      <w:pPr>
-        <w:pStyle w:val="NoSpacing"/>
-      </w:pPr>
-      <w:r>
-        <w:t xml:space="preserve">  full_name: "&lt;&lt;name:32.192.169.232:001&gt;&gt;"</w:t>
-        <w:br/>
-        <w:t xml:space="preserve">  ssn: "&lt;&lt;SSN:32.192.169.232:002&gt;&gt;"</w:t>
-        <w:br/>
-        <w:t xml:space="preserve">  phone: "&lt;&lt;phone:32.192.169.232:002&gt;&gt;"</w:t>
-        <w:br/>
-        <w:t xml:space="preserve">  email: "&lt;&lt;email:32.192.169.232:001&gt;&gt;"</w:t>
-        <w:br/>
-        <w:t xml:space="preserve">  checking account: "&lt;&lt;digit_shift:32.192.169.232:002&gt;&gt;"</w:t>
-        <w:br/>
-        <w:t xml:space="preserve">  investment account: "&lt;&lt;digit_shift:32.192.169.232:003&gt;&gt;"</w:t>
-        <w:br/>
-        <w:t xml:space="preserve">  savings account: "&lt;&lt;digit_shift:32.192.169.232:004&gt;&gt;"</w:t>
-      </w:r>
-    </w:p>
-    <w:p>
-      <w:r>
-        <w:t>What the user saw — all real data restored:</w:t>
-      </w:r>
-    </w:p>
-    <w:p>
-      <w:pPr>
-        <w:pStyle w:val="NoSpacing"/>
-      </w:pPr>
-      <w:r>
-        <w:t xml:space="preserve">  Name: Carlos Rivera</w:t>
-        <w:br/>
-        <w:t xml:space="preserve">  SSN: 323-45-6789</w:t>
-        <w:br/>
-        <w:t xml:space="preserve">  Checking: 6789-3345-0022 — $89,120.45</w:t>
-        <w:br/>
-        <w:t xml:space="preserve">  Investment: 6789-3345-0024 — $890,000.00</w:t>
-        <w:br/>
-        <w:t xml:space="preserve">  Savings: 6789-3345-0023 — $245,000.00</w:t>
-      </w:r>
-    </w:p>
-    <w:p/>
-    <w:p>
-      <w:r>
-        <w:t xml:space="preserve">And here's the best part — Qwen's last line in the response: </w:t>
-      </w:r>
-      <w:r>
-        <w:rPr>
-          <w:i/>
-        </w:rPr>
-        <w:t>"Please note that the actual numerical values for the SSN and account numbers are masked due to privacy concerns."</w:t>
-      </w:r>
-    </w:p>
-    <w:p>
-      <w:r>
-        <w:t>The LLM genuinely believed it showed the user masked data. It apologized for the "privacy masking" — not knowing that BIG-IP had already de-cloaked every token back to the real values. The LLM thought it was being responsible by noting the data was masked. The user saw the full, real, unmasked report.</w:t>
-      </w:r>
-    </w:p>
-    <w:p>
-      <w:r>
-        <w:t>That's Context Cloak working exactly as designed.</w:t>
-      </w:r>
-    </w:p>
-    <w:p>
-      <w:pPr>
-        <w:pStyle w:val="Heading3"/>
-      </w:pPr>
-      <w:r>
-        <w:t>Demo Architecture</w:t>
-      </w:r>
-    </w:p>
-    <w:p>
-      <w:pPr>
-        <w:jc w:val="center"/>
-      </w:pPr>
-      <w:r>
-        <w:rPr>
-          <w:b/>
-          <w:color w:val="0066CC"/>
-        </w:rPr>
-        <w:t>[GIF: docs/gifs/context_cloak_deploy.gif]</w:t>
-        <w:br/>
-        <w:t>Context Cloak GUI showing full configuration — MCP server, LLM endpoint, PII fields with cloaking modes, session config. One-click deploy creates all BIG-IP objects.</w:t>
-      </w:r>
-    </w:p>
-    <w:p>
-      <w:r>
-        <w:t>The demo runs on:</w:t>
-        <w:br/>
-        <w:t>• F5 BIG-IP VE v21.0.0.1 on AWS (m5.xlarge)</w:t>
-        <w:br/>
-        <w:t>• Qwen 2.5 14B Instruct AWQ on vLLM (NVIDIA L4, 24GB)</w:t>
-        <w:br/>
-        <w:t>• MCP Server (FastMCP + PostgreSQL) on Kubernetes (RKE2)</w:t>
-        <w:br/>
-        <w:t>• Open WebUI as the chat interface</w:t>
-        <w:br/>
-        <w:t>• Context Cloak iAppLX managing the entire configuration via web GUI</w:t>
-      </w:r>
-    </w:p>
-    <w:p>
-      <w:pPr>
-        <w:pStyle w:val="Heading3"/>
-      </w:pPr>
-      <w:r>
-        <w:t>Installation and Setup</w:t>
-      </w:r>
-    </w:p>
-    <w:p>
-      <w:pPr>
-        <w:jc w:val="center"/>
-      </w:pPr>
-      <w:r>
-        <w:rPr>
-          <w:b/>
-          <w:color w:val="0066CC"/>
-        </w:rPr>
-        <w:t>[GIF: docs/gifs/load_rpm.gif]</w:t>
-      </w:r>
-    </w:p>
-    <w:p>
-      <w:r>
-        <w:t>Installing the Context Cloak RPM via BIG-IP Package Management LX.</w:t>
-      </w:r>
-    </w:p>
-    <w:p>
-      <w:pPr>
-        <w:jc w:val="center"/>
-      </w:pPr>
-      <w:r>
-        <w:rPr>
-          <w:b/>
-          <w:color w:val="0066CC"/>
-        </w:rPr>
-        <w:t>[GIF: docs/gifs/show_vs.gif]</w:t>
-      </w:r>
-    </w:p>
-    <w:p>
-      <w:r>
-        <w:t>After deployment: BIG-IP Local Traffic showing the MCP VS and Inference VS created by Context Cloak.</w:t>
-      </w:r>
-    </w:p>
-    <w:p>
-      <w:pPr>
-        <w:pStyle w:val="Heading3"/>
-      </w:pPr>
-      <w:r>
-        <w:t>Baseline: No Cloaking</w:t>
-      </w:r>
-    </w:p>
-    <w:p>
-      <w:pPr>
-        <w:jc w:val="center"/>
-      </w:pPr>
-      <w:r>
-        <w:rPr>
-          <w:b/>
-          <w:color w:val="0066CC"/>
-        </w:rPr>
-        <w:t>[GIF: docs/gifs/test_no_cloak.gif]</w:t>
-      </w:r>
-    </w:p>
-    <w:p>
-      <w:r>
-        <w:t>Without Context Cloak: Open WebUI sends prompts directly to vLLM. All PII — names, SSNs, account numbers — flows to the LLM in cleartext. This is the "before" picture.</w:t>
-      </w:r>
-    </w:p>
-    <w:p>
-      <w:pPr>
-        <w:pStyle w:val="Heading3"/>
-      </w:pPr>
-      <w:r>
-        <w:t>Switching Modes</w:t>
-      </w:r>
-    </w:p>
-    <w:p>
-      <w:pPr>
-        <w:jc w:val="center"/>
-      </w:pPr>
-      <w:r>
-        <w:rPr>
-          <w:b/>
-          <w:color w:val="0066CC"/>
-        </w:rPr>
-        <w:t>[GIF: docs/gifs/context_cloak_change_to_tokenize.gif]</w:t>
-      </w:r>
-    </w:p>
-    <w:p>
-      <w:r>
-        <w:t>Changing PII field modes from Substitute to Tokenize in the Context Cloak GUI. Per-field configuration — mix and match modes based on your security requirements.</w:t>
+        <w:t>Context Cloak iAppLX v0.2.0</w:t>
       </w:r>
     </w:p>
     <w:sectPr>
@@ -1499,6 +2713,9 @@
     <w:name w:val="Normal"/>
     <w:qFormat/>
     <w:rsid w:val="00FC693F"/>
+    <w:pPr>
+      <w:spacing w:after="120" w:line="276" w:lineRule="auto"/>
+    </w:pPr>
     <w:rPr>
       <w:rFonts w:ascii="Calibri" w:hAnsi="Calibri"/>
       <w:sz w:val="22"/>
@@ -13185,6 +14402,17 @@
         <w:shd w:val="clear" w:color="auto" w:fill="FBCAA2" w:themeFill="accent6" w:themeFillTint="7F"/>
       </w:tcPr>
     </w:tblStylePr>
+  </w:style>
+  <w:style w:type="paragraph" w:customStyle="1" w:styleId="CodeBlock">
+    <w:name w:val="CodeBlock"/>
+    <w:pPr>
+      <w:spacing w:before="80" w:after="80"/>
+    </w:pPr>
+    <w:rPr>
+      <w:rFonts w:ascii="Consolas" w:hAnsi="Consolas"/>
+      <w:color w:val="DCDCDC"/>
+      <w:sz w:val="18"/>
+    </w:rPr>
   </w:style>
 </w:styles>
 </file>

</xml_diff>